<commit_message>
Prevent learning plan template layout shifts
</commit_message>
<xml_diff>
--- a/src/templates/learning-plan-template.docx
+++ b/src/templates/learning-plan-template.docx
@@ -289,7 +289,7 @@
           <w:szCs w:val="32"/>
           <w:cs/>
         </w:rPr>
-        <w:t>{{subject_name}}</w:t>
+        <w:t>{{course}}</w:t>
       </w:r>
     </w:p>
     <w:p>
@@ -346,7 +346,7 @@
           <w:szCs w:val="32"/>
           <w:cs/>
         </w:rPr>
-        <w:t xml:space="preserve">{{subject_code}} </w:t>
+        <w:t xml:space="preserve">{{course_code}} </w:t>
       </w:r>
     </w:p>
     <w:p>
@@ -454,7 +454,7 @@
           <w:szCs w:val="32"/>
           <w:cs/>
         </w:rPr>
-        <w:t>{{subject_category}}</w:t>
+        <w:t>{{category}}</w:t>
       </w:r>
     </w:p>
     <w:p>
@@ -518,7 +518,7 @@
           <w:szCs w:val="32"/>
           <w:cs/>
         </w:rPr>
-        <w:t>{{occupational_group}}</w:t>
+        <w:t>{{career_group}}</w:t>
       </w:r>
     </w:p>
     <w:p>
@@ -579,7 +579,7 @@
           <w:sz w:val="32"/>
           <w:szCs w:val="32"/>
         </w:rPr>
-        <w:t>){{student_program}}</w:t>
+        <w:t>){{program}}</w:t>
       </w:r>
     </w:p>
     <w:p>
@@ -643,7 +643,7 @@
           <w:szCs w:val="32"/>
           <w:cs/>
         </w:rPr>
-        <w:t>{{teacher_name}}</w:t>
+        <w:t>{{teacher}}</w:t>
       </w:r>
     </w:p>
     <w:p>
@@ -742,7 +742,7 @@
           <w:sz w:val="32"/>
           <w:szCs w:val="32"/>
         </w:rPr>
-        <w:t>) {{teacher_name}}</w:t>
+        <w:t>) {{teacher}}</w:t>
       </w:r>
       <w:r>
         <w:rPr>
@@ -806,7 +806,7 @@
           <w:sz w:val="32"/>
           <w:szCs w:val="32"/>
         </w:rPr>
-        <w:t>(Date){{teacher_approval_date}}</w:t>
+        <w:t>(Date){{teacher_date}}</w:t>
       </w:r>
     </w:p>
     <w:p>
@@ -894,7 +894,7 @@
           <w:sz w:val="32"/>
           <w:szCs w:val="32"/>
         </w:rPr>
-        <w:t>{{department_head_name}}</w:t>
+        <w:t>{{dept_head}}</w:t>
       </w:r>
       <w:r>
         <w:rPr>
@@ -940,7 +940,7 @@
           <w:sz w:val="32"/>
           <w:szCs w:val="32"/>
         </w:rPr>
-        <w:t>(Date) {{department_head_approval_date}}</w:t>
+        <w:t>(Date) {{dept_date}}</w:t>
       </w:r>
       <w:r>
         <w:rPr>
@@ -996,7 +996,7 @@
           <w:sz w:val="32"/>
           <w:szCs w:val="32"/>
         </w:rPr>
-        <w:t>(Academic Director) {{academic_director_name}}</w:t>
+        <w:t>(Academic Director) {{director}}</w:t>
       </w:r>
       <w:r>
         <w:rPr>
@@ -1059,7 +1059,7 @@
           <w:sz w:val="32"/>
           <w:szCs w:val="32"/>
         </w:rPr>
-        <w:t>Date) {{academic_director_approval_date}}</w:t>
+        <w:t>Date) {{director_date}}</w:t>
       </w:r>
       <w:r>
         <w:rPr>
@@ -1327,7 +1327,7 @@
           <w:b w:val="0"/>
           <w:bCs w:val="0"/>
         </w:rPr>
-        <w:t>{{teacher_signature}}</w:t>
+        <w:t>{{teacher_sign}}</w:t>
       </w:r>
       <w:r>
         <w:rPr>
@@ -1433,7 +1433,7 @@
           <w:b w:val="0"/>
           <w:bCs w:val="0"/>
         </w:rPr>
-        <w:t>{{teacher_name}}</w:t>
+        <w:t>{{teacher}}</w:t>
       </w:r>
       <w:r>
         <w:rPr>
@@ -3928,7 +3928,7 @@
           <w:szCs w:val="32"/>
           <w:cs/>
         </w:rPr>
-        <w:t>ประเภทวิชา {{subject_category}} กลุ่มอาชีพ {{occupational_group}} สาขาวิชา {{student_program}}</w:t>
+        <w:t>ประเภทวิชา {{category}} กลุ่มอาชีพ {{career_group}} สาขาวิชา {{program}}</w:t>
       </w:r>
       <w:r>
         <w:rPr>
@@ -4165,7 +4165,7 @@
           <w:szCs w:val="32"/>
           <w:cs/>
         </w:rPr>
-        <w:t>{{subject_code_and_name}}</w:t>
+        <w:t>{{course_label}}</w:t>
       </w:r>
       <w:r>
         <w:rPr>
@@ -6041,7 +6041,7 @@
               </w:rPr>
             </w:pPr>
             <w:r>
-              <w:t>{{competency_unit_code}}</w:t>
+              <w:t>{{uc_code}}</w:t>
             </w:r>
           </w:p>
         </w:tc>
@@ -6060,7 +6060,7 @@
               </w:rPr>
             </w:pPr>
             <w:r>
-              <w:t>{{competency_unit_description}}</w:t>
+              <w:t>{{uc_desc}}</w:t>
             </w:r>
           </w:p>
         </w:tc>
@@ -6078,7 +6078,7 @@
               </w:rPr>
             </w:pPr>
             <w:r>
-              <w:t>{{element_code}}</w:t>
+              <w:t>{{eoc_code}}</w:t>
             </w:r>
           </w:p>
         </w:tc>
@@ -6096,7 +6096,7 @@
               </w:rPr>
             </w:pPr>
             <w:r>
-              <w:t>{{element_description}}</w:t>
+              <w:t>{{eoc_desc}}</w:t>
             </w:r>
           </w:p>
         </w:tc>
@@ -6114,7 +6114,7 @@
               </w:rPr>
             </w:pPr>
             <w:r>
-              <w:t>{{performance_criteria}}</w:t>
+              <w:t>{{criteria}}</w:t>
             </w:r>
           </w:p>
         </w:tc>
@@ -6133,7 +6133,7 @@
               </w:rPr>
             </w:pPr>
             <w:r>
-              <w:t>{{assessment_procedure}}</w:t>
+              <w:t>{{assess_method}}</w:t>
             </w:r>
           </w:p>
         </w:tc>
@@ -7868,7 +7868,7 @@
               <w:rPr>
                 <w:rFonts w:ascii="TH SarabunPSK" w:eastAsia="Times New Roman" w:hAnsi="TH SarabunPSK" w:cs="TH SarabunPSK"/>
               </w:rPr>
-              <w:t>{{course_job_outcome}}</w:t>
+              <w:t>{{job_outcome}}</w:t>
             </w:r>
             <w:r>
               <w:rPr>
@@ -8250,7 +8250,7 @@
               </w:rPr>
             </w:pPr>
             <w:r>
-              <w:t>{{occupational_element}}</w:t>
+              <w:t>{{occ_element}}</w:t>
             </w:r>
           </w:p>
         </w:tc>
@@ -8267,7 +8267,7 @@
               </w:rPr>
             </w:pPr>
             <w:r>
-              <w:t>{{operational_knowledge}}</w:t>
+              <w:t>{{op_knowledge}}</w:t>
             </w:r>
           </w:p>
         </w:tc>
@@ -8285,7 +8285,7 @@
               </w:rPr>
             </w:pPr>
             <w:r>
-              <w:t>{{operational_skills}}</w:t>
+              <w:t>{{op_skills}}</w:t>
             </w:r>
           </w:p>
         </w:tc>
@@ -9554,7 +9554,7 @@
           <w:b/>
           <w:bCs/>
         </w:rPr>
-        <w:t>Code){{subject_code}}</w:t>
+        <w:t>Code){{course_code}}</w:t>
       </w:r>
       <w:r>
         <w:rPr>
@@ -9623,7 +9623,7 @@
           <w:bCs/>
           <w:cs/>
         </w:rPr>
-        <w:t>{{subject_name}}</w:t>
+        <w:t>{{course}}</w:t>
       </w:r>
       <w:r>
         <w:rPr>
@@ -9720,7 +9720,7 @@
           <w:b/>
           <w:bCs/>
         </w:rPr>
-        <w:t>Department){{student_program}}</w:t>
+        <w:t>Department){{program}}</w:t>
       </w:r>
       <w:r>
         <w:rPr>
@@ -10598,7 +10598,7 @@
               </w:rPr>
             </w:pPr>
             <w:r>
-              <w:t>{{analysis_unit_name}}</w:t>
+              <w:t>{{a_unit}}</w:t>
             </w:r>
           </w:p>
         </w:tc>
@@ -10615,7 +10615,7 @@
               </w:rPr>
             </w:pPr>
             <w:r>
-              <w:t>{{knowledge_score}}</w:t>
+              <w:t>{{a_know}}</w:t>
             </w:r>
           </w:p>
         </w:tc>
@@ -10632,7 +10632,7 @@
               </w:rPr>
             </w:pPr>
             <w:r>
-              <w:t>{{comprehension_score}}</w:t>
+              <w:t>{{a_comp}}</w:t>
             </w:r>
           </w:p>
         </w:tc>
@@ -10649,7 +10649,7 @@
               </w:rPr>
             </w:pPr>
             <w:r>
-              <w:t>{{implementation_score}}</w:t>
+              <w:t>{{a_use}}</w:t>
             </w:r>
           </w:p>
         </w:tc>
@@ -10666,7 +10666,7 @@
               </w:rPr>
             </w:pPr>
             <w:r>
-              <w:t>{{analysis_score}}</w:t>
+              <w:t>{{a_analysis}}</w:t>
             </w:r>
           </w:p>
         </w:tc>
@@ -10683,7 +10683,7 @@
               </w:rPr>
             </w:pPr>
             <w:r>
-              <w:t>{{synthesis_score}}</w:t>
+              <w:t>{{a_synth}}</w:t>
             </w:r>
           </w:p>
         </w:tc>
@@ -10700,7 +10700,7 @@
               </w:rPr>
             </w:pPr>
             <w:r>
-              <w:t>{{evaluation_score}}</w:t>
+              <w:t>{{a_eval}}</w:t>
             </w:r>
           </w:p>
         </w:tc>
@@ -10717,7 +10717,7 @@
               </w:rPr>
             </w:pPr>
             <w:r>
-              <w:t>{{skill_score}}</w:t>
+              <w:t>{{a_skill}}</w:t>
             </w:r>
           </w:p>
         </w:tc>
@@ -10734,7 +10734,7 @@
               </w:rPr>
             </w:pPr>
             <w:r>
-              <w:t>{{attitude_score}}</w:t>
+              <w:t>{{a_attitude}}</w:t>
             </w:r>
           </w:p>
         </w:tc>
@@ -10750,7 +10750,7 @@
               </w:rPr>
             </w:pPr>
             <w:r>
-              <w:t>{{application_score}}</w:t>
+              <w:t>{{a_apply}}</w:t>
             </w:r>
           </w:p>
         </w:tc>
@@ -10767,7 +10767,7 @@
               </w:rPr>
             </w:pPr>
             <w:r>
-              <w:t>{{total_score}}</w:t>
+              <w:t>{{a_total}}</w:t>
             </w:r>
           </w:p>
         </w:tc>
@@ -10784,7 +10784,7 @@
               </w:rPr>
             </w:pPr>
             <w:r>
-              <w:t>{{priority}}</w:t>
+              <w:t>{{a_priority}}</w:t>
             </w:r>
           </w:p>
         </w:tc>
@@ -10801,7 +10801,7 @@
               </w:rPr>
             </w:pPr>
             <w:r>
-              <w:t>{{period_count}}</w:t>
+              <w:t>{{a_periods}}</w:t>
             </w:r>
           </w:p>
         </w:tc>
@@ -15102,7 +15102,7 @@
           <w:szCs w:val="36"/>
           <w:cs/>
         </w:rPr>
-        <w:t>{{subject_code}}</w:t>
+        <w:t>{{course_code}}</w:t>
       </w:r>
       <w:r>
         <w:rPr>
@@ -15134,7 +15134,7 @@
           <w:szCs w:val="36"/>
           <w:cs/>
         </w:rPr>
-        <w:t>{{subject_name}}</w:t>
+        <w:t>{{course}}</w:t>
       </w:r>
     </w:p>
     <w:p>
@@ -15575,7 +15575,7 @@
               </w:rPr>
             </w:pPr>
             <w:r>
-              <w:t>{{schedule_unit_no}}</w:t>
+              <w:t>{{s_no}}</w:t>
             </w:r>
           </w:p>
         </w:tc>
@@ -15596,7 +15596,7 @@
               </w:rPr>
             </w:pPr>
             <w:r>
-              <w:t>{{schedule_unit_title}}</w:t>
+              <w:t>{{s_unit}}</w:t>
             </w:r>
           </w:p>
         </w:tc>
@@ -15616,7 +15616,7 @@
               </w:rPr>
             </w:pPr>
             <w:r>
-              <w:t>{{schedule_theory_hours}}</w:t>
+              <w:t>{{s_theory}}</w:t>
             </w:r>
           </w:p>
         </w:tc>
@@ -15636,7 +15636,7 @@
               </w:rPr>
             </w:pPr>
             <w:r>
-              <w:t>{{schedule_practical_hours}}</w:t>
+              <w:t>{{s_practice}}</w:t>
             </w:r>
           </w:p>
         </w:tc>
@@ -15656,7 +15656,7 @@
               </w:rPr>
             </w:pPr>
             <w:r>
-              <w:t>{{schedule_total_hours}}</w:t>
+              <w:t>{{s_total}}</w:t>
             </w:r>
           </w:p>
         </w:tc>
@@ -20605,7 +20605,7 @@
               </w:rPr>
             </w:pPr>
             <w:r>
-              <w:t>{{evaluated_competency}}</w:t>
+              <w:t>{{e_comp}}</w:t>
             </w:r>
           </w:p>
         </w:tc>
@@ -20622,7 +20622,7 @@
               </w:rPr>
             </w:pPr>
             <w:r>
-              <w:t>{{expected_level}}</w:t>
+              <w:t>{{e_expect}}</w:t>
             </w:r>
           </w:p>
         </w:tc>
@@ -20638,7 +20638,7 @@
               </w:rPr>
             </w:pPr>
             <w:r>
-              <w:t>{{ability_level_1}}</w:t>
+              <w:t>{{e_l1}}</w:t>
             </w:r>
           </w:p>
         </w:tc>
@@ -20654,7 +20654,7 @@
               </w:rPr>
             </w:pPr>
             <w:r>
-              <w:t>{{ability_level_2}}</w:t>
+              <w:t>{{e_l2}}</w:t>
             </w:r>
           </w:p>
         </w:tc>
@@ -20670,7 +20670,7 @@
               </w:rPr>
             </w:pPr>
             <w:r>
-              <w:t>{{ability_level_3}}</w:t>
+              <w:t>{{e_l3}}</w:t>
             </w:r>
           </w:p>
         </w:tc>
@@ -20686,7 +20686,7 @@
               </w:rPr>
             </w:pPr>
             <w:r>
-              <w:t>{{ability_level_4}}</w:t>
+              <w:t>{{e_l4}}</w:t>
             </w:r>
           </w:p>
         </w:tc>
@@ -20702,7 +20702,7 @@
               </w:rPr>
             </w:pPr>
             <w:r>
-              <w:t>{{ability_level_5}}</w:t>
+              <w:t>{{e_l5}}</w:t>
             </w:r>
           </w:p>
         </w:tc>
@@ -20717,7 +20717,7 @@
               </w:rPr>
             </w:pPr>
             <w:r>
-              <w:t>{{learner_percentage}}</w:t>
+              <w:t>{{e_percent}}</w:t>
             </w:r>
           </w:p>
         </w:tc>
@@ -21303,7 +21303,7 @@
           <w:sz w:val="30"/>
           <w:szCs w:val="30"/>
         </w:rPr>
-        <w:t>{{teacher_signature}}</w:t>
+        <w:t>{{teacher_sign}}</w:t>
       </w:r>
       <w:r>
         <w:rPr>
@@ -21554,7 +21554,7 @@
                 <w:rFonts w:ascii="TH SarabunPSK" w:hAnsi="TH SarabunPSK" w:cs="TH SarabunPSK"/>
                 <w:szCs w:val="32"/>
               </w:rPr>
-              <w:t>{{worksheet_no}}</w:t>
+              <w:t>{{sheet_no}}</w:t>
             </w:r>
           </w:p>
         </w:tc>
@@ -21709,7 +21709,7 @@
                 <w:rFonts w:ascii="TH SarabunPSK" w:hAnsi="TH SarabunPSK" w:cs="TH SarabunPSK"/>
                 <w:szCs w:val="32"/>
               </w:rPr>
-              <w:t>{{subject_code}}</w:t>
+              <w:t>{{course_code}}</w:t>
             </w:r>
             <w:r>
               <w:rPr>
@@ -21787,7 +21787,7 @@
                 <w:rFonts w:ascii="TH SarabunPSK" w:hAnsi="TH SarabunPSK" w:cs="TH SarabunPSK"/>
                 <w:szCs w:val="32"/>
               </w:rPr>
-              <w:t>{{subject_name}}</w:t>
+              <w:t>{{course}}</w:t>
             </w:r>
             <w:r>
               <w:rPr>
@@ -21830,7 +21830,7 @@
                 <w:szCs w:val="32"/>
                 <w:cs/>
               </w:rPr>
-              <w:t>{{teaching_session_no}}</w:t>
+              <w:t>{{session_no}}</w:t>
             </w:r>
             <w:r>
               <w:rPr>
@@ -22958,7 +22958,7 @@
           <w:szCs w:val="32"/>
           <w:cs/>
         </w:rPr>
-        <w:t xml:space="preserve"> {{department_head_signature}}</w:t>
+        <w:t xml:space="preserve"> {{dept_sign}}</w:t>
       </w:r>
       <w:r>
         <w:rPr>
@@ -22986,7 +22986,7 @@
           <w:szCs w:val="32"/>
           <w:cs/>
         </w:rPr>
-        <w:t>({{department_head_name}})</w:t>
+        <w:t>({{dept_head}})</w:t>
       </w:r>
       <w:r>
         <w:rPr>
@@ -23135,7 +23135,7 @@
           <w:szCs w:val="32"/>
           <w:cs/>
         </w:rPr>
-        <w:t>{{department_head_decision_date}}</w:t>
+        <w:t>{{dept_decision_date}}</w:t>
       </w:r>
     </w:p>
     <w:p>
@@ -23289,7 +23289,7 @@
           <w:szCs w:val="32"/>
           <w:cs/>
         </w:rPr>
-        <w:t xml:space="preserve">ลงชื่อ {{academic_director_signature}} </w:t>
+        <w:t xml:space="preserve">ลงชื่อ {{director_sign}} </w:t>
       </w:r>
     </w:p>
     <w:p>
@@ -23317,7 +23317,7 @@
           <w:szCs w:val="32"/>
           <w:cs/>
         </w:rPr>
-        <w:t>({{academic_director_name}})</w:t>
+        <w:t>({{director}})</w:t>
       </w:r>
     </w:p>
     <w:p>
@@ -23459,7 +23459,7 @@
           <w:szCs w:val="32"/>
           <w:cs/>
         </w:rPr>
-        <w:t>{{academic_director_decision_date}}</w:t>
+        <w:t>{{director_decision_date}}</w:t>
       </w:r>
     </w:p>
     <w:p>

</xml_diff>

<commit_message>
Repair multi-unit learning plan Word exports
</commit_message>
<xml_diff>
--- a/src/templates/learning-plan-template.docx
+++ b/src/templates/learning-plan-template.docx
@@ -253,7 +253,7 @@
           <w:szCs w:val="32"/>
           <w:cs/>
         </w:rPr>
-        <w:t>รายวิชา</w:t>
+        <w:t xml:space="preserve">รายวิชา (Subject) {{course}}</w:t>
       </w:r>
       <w:r>
         <w:rPr>
@@ -262,7 +262,7 @@
           <w:szCs w:val="32"/>
           <w:cs/>
         </w:rPr>
-        <w:t xml:space="preserve"> </w:t>
+        <w:t xml:space="preserve"/>
       </w:r>
       <w:r>
         <w:rPr>
@@ -270,7 +270,7 @@
           <w:sz w:val="32"/>
           <w:szCs w:val="32"/>
         </w:rPr>
-        <w:t>(Subject)</w:t>
+        <w:t/>
       </w:r>
       <w:r>
         <w:rPr>
@@ -280,7 +280,7 @@
           <w:sz w:val="32"/>
           <w:szCs w:val="32"/>
         </w:rPr>
-        <w:t xml:space="preserve"> </w:t>
+        <w:t xml:space="preserve"/>
       </w:r>
       <w:r>
         <w:rPr>
@@ -289,7 +289,7 @@
           <w:szCs w:val="32"/>
           <w:cs/>
         </w:rPr>
-        <w:t>{{course}}</w:t>
+        <w:t/>
       </w:r>
     </w:p>
     <w:p>
@@ -311,7 +311,7 @@
           <w:szCs w:val="32"/>
           <w:cs/>
         </w:rPr>
-        <w:t xml:space="preserve">รหัสวิชา </w:t>
+        <w:t xml:space="preserve">รหัสวิชา (Subject Code)  {{course_code}} </w:t>
       </w:r>
       <w:r>
         <w:rPr>
@@ -319,7 +319,7 @@
           <w:sz w:val="28"/>
           <w:szCs w:val="28"/>
         </w:rPr>
-        <w:t>(Subject Code)</w:t>
+        <w:t/>
       </w:r>
       <w:r>
         <w:rPr>
@@ -328,7 +328,7 @@
           <w:szCs w:val="32"/>
           <w:cs/>
         </w:rPr>
-        <w:t xml:space="preserve"> </w:t>
+        <w:t xml:space="preserve"/>
       </w:r>
       <w:r>
         <w:rPr>
@@ -337,7 +337,7 @@
           <w:szCs w:val="32"/>
           <w:cs/>
         </w:rPr>
-        <w:t xml:space="preserve"> </w:t>
+        <w:t xml:space="preserve"/>
       </w:r>
       <w:r>
         <w:rPr>
@@ -346,7 +346,7 @@
           <w:szCs w:val="32"/>
           <w:cs/>
         </w:rPr>
-        <w:t xml:space="preserve">{{course_code}} </w:t>
+        <w:t xml:space="preserve"/>
       </w:r>
     </w:p>
     <w:p>
@@ -370,7 +370,7 @@
           <w:szCs w:val="32"/>
           <w:cs/>
         </w:rPr>
-        <w:t>หลักสูตร</w:t>
+        <w:t xml:space="preserve">หลักสูตร (Curriculum) {{curriculum}} ประเภทวิชา (Section) {{category}}</w:t>
       </w:r>
       <w:r>
         <w:rPr>
@@ -382,14 +382,14 @@
           <w:szCs w:val="32"/>
           <w:cs/>
         </w:rPr>
-        <w:t xml:space="preserve"> </w:t>
+        <w:t xml:space="preserve"/>
       </w:r>
       <w:r>
         <w:rPr>
           <w:rFonts w:ascii="TH SarabunPSK" w:hAnsi="TH SarabunPSK" w:cs="TH SarabunPSK"/>
           <w:spacing w:val="-10"/>
         </w:rPr>
-        <w:t>(Curriculum)</w:t>
+        <w:t/>
       </w:r>
       <w:r>
         <w:rPr>
@@ -399,7 +399,7 @@
           <w:szCs w:val="32"/>
           <w:cs/>
         </w:rPr>
-        <w:t xml:space="preserve"> {{curriculum}}</w:t>
+        <w:t xml:space="preserve"/>
       </w:r>
       <w:r>
         <w:rPr>
@@ -411,7 +411,7 @@
           <w:szCs w:val="32"/>
           <w:cs/>
         </w:rPr>
-        <w:t xml:space="preserve"> </w:t>
+        <w:t xml:space="preserve"/>
       </w:r>
       <w:r>
         <w:rPr>
@@ -423,28 +423,28 @@
           <w:szCs w:val="32"/>
           <w:cs/>
         </w:rPr>
-        <w:t>ประเภทวิชา</w:t>
+        <w:t/>
       </w:r>
       <w:r>
         <w:rPr>
           <w:rFonts w:ascii="TH SarabunPSK" w:hAnsi="TH SarabunPSK" w:cs="TH SarabunPSK"/>
           <w:spacing w:val="-10"/>
         </w:rPr>
-        <w:t xml:space="preserve"> (</w:t>
+        <w:t xml:space="preserve"/>
       </w:r>
       <w:r>
         <w:rPr>
           <w:rFonts w:ascii="TH SarabunPSK" w:hAnsi="TH SarabunPSK" w:cs="TH SarabunPSK"/>
           <w:spacing w:val="-10"/>
         </w:rPr>
-        <w:t>Section)</w:t>
+        <w:t/>
       </w:r>
       <w:r>
         <w:rPr>
           <w:rFonts w:ascii="TH SarabunPSK" w:hAnsi="TH SarabunPSK" w:cs="TH SarabunPSK"/>
           <w:spacing w:val="-10"/>
         </w:rPr>
-        <w:t xml:space="preserve"> </w:t>
+        <w:t xml:space="preserve"/>
       </w:r>
       <w:r>
         <w:rPr>
@@ -454,7 +454,7 @@
           <w:szCs w:val="32"/>
           <w:cs/>
         </w:rPr>
-        <w:t>{{category}}</w:t>
+        <w:t/>
       </w:r>
     </w:p>
     <w:p>
@@ -479,7 +479,7 @@
           <w:szCs w:val="32"/>
           <w:cs/>
         </w:rPr>
-        <w:t>กลุ่มอาชีพ</w:t>
+        <w:t xml:space="preserve">กลุ่มอาชีพ (Occupational groups) {{career_group}}</w:t>
       </w:r>
       <w:r>
         <w:rPr>
@@ -489,7 +489,7 @@
           <w:szCs w:val="32"/>
           <w:cs/>
         </w:rPr>
-        <w:t xml:space="preserve"> (</w:t>
+        <w:t xml:space="preserve"/>
       </w:r>
       <w:r>
         <w:rPr>
@@ -498,7 +498,7 @@
           <w:sz w:val="32"/>
           <w:szCs w:val="32"/>
         </w:rPr>
-        <w:t>Occupational groups</w:t>
+        <w:t/>
       </w:r>
       <w:r>
         <w:rPr>
@@ -508,7 +508,7 @@
           <w:szCs w:val="32"/>
           <w:cs/>
         </w:rPr>
-        <w:t xml:space="preserve">) </w:t>
+        <w:t xml:space="preserve"/>
       </w:r>
       <w:r>
         <w:rPr>
@@ -518,7 +518,7 @@
           <w:szCs w:val="32"/>
           <w:cs/>
         </w:rPr>
-        <w:t>{{career_group}}</w:t>
+        <w:t/>
       </w:r>
     </w:p>
     <w:p>
@@ -542,7 +542,7 @@
           <w:szCs w:val="32"/>
           <w:cs/>
         </w:rPr>
-        <w:t>สาขาวิชา</w:t>
+        <w:t xml:space="preserve">สาขาวิชา (Program){{program}}</w:t>
       </w:r>
       <w:r>
         <w:rPr>
@@ -552,7 +552,7 @@
           <w:szCs w:val="32"/>
           <w:cs/>
         </w:rPr>
-        <w:t xml:space="preserve"> </w:t>
+        <w:t xml:space="preserve"/>
       </w:r>
       <w:r>
         <w:rPr>
@@ -561,7 +561,7 @@
           <w:sz w:val="32"/>
           <w:szCs w:val="32"/>
         </w:rPr>
-        <w:t>(P</w:t>
+        <w:t/>
       </w:r>
       <w:r>
         <w:rPr>
@@ -570,7 +570,7 @@
           <w:sz w:val="32"/>
           <w:szCs w:val="32"/>
         </w:rPr>
-        <w:t>rogram</w:t>
+        <w:t/>
       </w:r>
       <w:r>
         <w:rPr>
@@ -579,7 +579,7 @@
           <w:sz w:val="32"/>
           <w:szCs w:val="32"/>
         </w:rPr>
-        <w:t>){{program}}</w:t>
+        <w:t/>
       </w:r>
     </w:p>
     <w:p>
@@ -601,7 +601,7 @@
           <w:szCs w:val="32"/>
           <w:cs/>
         </w:rPr>
-        <w:t xml:space="preserve">อาจารย์ประจำวิชา </w:t>
+        <w:t xml:space="preserve">อาจารย์ประจำวิชา (Instructor) {{teacher}}</w:t>
       </w:r>
       <w:r>
         <w:rPr>
@@ -609,7 +609,7 @@
           <w:sz w:val="32"/>
           <w:szCs w:val="32"/>
         </w:rPr>
-        <w:t>(</w:t>
+        <w:t/>
       </w:r>
       <w:r>
         <w:rPr>
@@ -617,7 +617,7 @@
           <w:sz w:val="32"/>
           <w:szCs w:val="32"/>
         </w:rPr>
-        <w:t>Instructor</w:t>
+        <w:t/>
       </w:r>
       <w:r>
         <w:rPr>
@@ -625,7 +625,7 @@
           <w:sz w:val="32"/>
           <w:szCs w:val="32"/>
         </w:rPr>
-        <w:t>)</w:t>
+        <w:t/>
       </w:r>
       <w:r>
         <w:rPr>
@@ -634,7 +634,7 @@
           <w:szCs w:val="32"/>
           <w:cs/>
         </w:rPr>
-        <w:t xml:space="preserve"> </w:t>
+        <w:t xml:space="preserve"/>
       </w:r>
       <w:r>
         <w:rPr>
@@ -643,7 +643,7 @@
           <w:szCs w:val="32"/>
           <w:cs/>
         </w:rPr>
-        <w:t>{{teacher}}</w:t>
+        <w:t/>
       </w:r>
     </w:p>
     <w:p>
@@ -709,7 +709,7 @@
           <w:szCs w:val="32"/>
           <w:cs/>
         </w:rPr>
-        <w:t>ผู้สอน</w:t>
+        <w:t xml:space="preserve">ผู้สอน (Instructor) {{teacher}}วันที่ (Date){{teacher_date}}</w:t>
       </w:r>
       <w:r>
         <w:rPr>
@@ -718,7 +718,7 @@
           <w:szCs w:val="32"/>
           <w:cs/>
         </w:rPr>
-        <w:t xml:space="preserve"> </w:t>
+        <w:t xml:space="preserve"/>
       </w:r>
       <w:r>
         <w:rPr>
@@ -726,7 +726,7 @@
           <w:sz w:val="32"/>
           <w:szCs w:val="32"/>
         </w:rPr>
-        <w:t>(</w:t>
+        <w:t/>
       </w:r>
       <w:r>
         <w:rPr>
@@ -734,7 +734,7 @@
           <w:sz w:val="32"/>
           <w:szCs w:val="32"/>
         </w:rPr>
-        <w:t>Instructor</w:t>
+        <w:t/>
       </w:r>
       <w:r>
         <w:rPr>
@@ -742,7 +742,7 @@
           <w:sz w:val="32"/>
           <w:szCs w:val="32"/>
         </w:rPr>
-        <w:t>) {{teacher}}</w:t>
+        <w:t/>
       </w:r>
       <w:r>
         <w:rPr>
@@ -789,7 +789,7 @@
           <w:szCs w:val="32"/>
           <w:cs/>
         </w:rPr>
-        <w:t>วันที่</w:t>
+        <w:t/>
       </w:r>
       <w:r>
         <w:rPr>
@@ -798,7 +798,7 @@
           <w:szCs w:val="32"/>
           <w:cs/>
         </w:rPr>
-        <w:t xml:space="preserve"> </w:t>
+        <w:t xml:space="preserve"/>
       </w:r>
       <w:r>
         <w:rPr>
@@ -806,7 +806,7 @@
           <w:sz w:val="32"/>
           <w:szCs w:val="32"/>
         </w:rPr>
-        <w:t>(Date){{teacher_date}}</w:t>
+        <w:t/>
       </w:r>
     </w:p>
     <w:p>
@@ -826,7 +826,7 @@
           <w:szCs w:val="32"/>
           <w:cs/>
         </w:rPr>
-        <w:t>หัวหน้า</w:t>
+        <w:t xml:space="preserve">หัวหน้าสาขาวิชา (Department Head) {{dept_head}} วันที่ (Date) {{dept_date}}</w:t>
       </w:r>
       <w:r>
         <w:rPr>
@@ -837,7 +837,7 @@
           <w:szCs w:val="32"/>
           <w:cs/>
         </w:rPr>
-        <w:t>สาข</w:t>
+        <w:t/>
       </w:r>
       <w:r>
         <w:rPr>
@@ -848,7 +848,7 @@
           <w:szCs w:val="32"/>
           <w:cs/>
         </w:rPr>
-        <w:t>าวิชา</w:t>
+        <w:t/>
       </w:r>
       <w:r>
         <w:rPr>
@@ -859,7 +859,7 @@
           <w:szCs w:val="32"/>
           <w:cs/>
         </w:rPr>
-        <w:t xml:space="preserve"> </w:t>
+        <w:t xml:space="preserve"/>
       </w:r>
       <w:r>
         <w:rPr>
@@ -868,7 +868,7 @@
           <w:szCs w:val="32"/>
           <w:cs/>
         </w:rPr>
-        <w:t>(</w:t>
+        <w:t/>
       </w:r>
       <w:r>
         <w:rPr>
@@ -876,7 +876,7 @@
           <w:sz w:val="32"/>
           <w:szCs w:val="32"/>
         </w:rPr>
-        <w:t>Department Head)</w:t>
+        <w:t/>
       </w:r>
       <w:r>
         <w:rPr>
@@ -886,7 +886,7 @@
           <w:sz w:val="32"/>
           <w:szCs w:val="32"/>
         </w:rPr>
-        <w:t xml:space="preserve"> </w:t>
+        <w:t xml:space="preserve"/>
       </w:r>
       <w:r>
         <w:rPr>
@@ -894,7 +894,7 @@
           <w:sz w:val="32"/>
           <w:szCs w:val="32"/>
         </w:rPr>
-        <w:t>{{dept_head}}</w:t>
+        <w:t/>
       </w:r>
       <w:r>
         <w:rPr>
@@ -903,7 +903,7 @@
           <w:szCs w:val="32"/>
           <w:cs/>
         </w:rPr>
-        <w:t xml:space="preserve"> </w:t>
+        <w:t xml:space="preserve"/>
       </w:r>
       <w:r>
         <w:rPr>
@@ -923,7 +923,7 @@
           <w:szCs w:val="32"/>
           <w:cs/>
         </w:rPr>
-        <w:t>วันที่</w:t>
+        <w:t/>
       </w:r>
       <w:r>
         <w:rPr>
@@ -932,7 +932,7 @@
           <w:szCs w:val="32"/>
           <w:cs/>
         </w:rPr>
-        <w:t xml:space="preserve"> </w:t>
+        <w:t xml:space="preserve"/>
       </w:r>
       <w:r>
         <w:rPr>
@@ -940,7 +940,7 @@
           <w:sz w:val="32"/>
           <w:szCs w:val="32"/>
         </w:rPr>
-        <w:t>(Date) {{dept_date}}</w:t>
+        <w:t/>
       </w:r>
       <w:r>
         <w:rPr>
@@ -979,7 +979,7 @@
           <w:szCs w:val="32"/>
           <w:cs/>
         </w:rPr>
-        <w:t>รองผู้อำนวยฝ่ายการศึกษา</w:t>
+        <w:t xml:space="preserve">รองผู้อำนวยฝ่ายการศึกษา (Academic Director) {{director}}วันที่ (Date) {{director_date}}</w:t>
       </w:r>
       <w:r>
         <w:rPr>
@@ -988,7 +988,7 @@
           <w:szCs w:val="32"/>
           <w:cs/>
         </w:rPr>
-        <w:t xml:space="preserve"> </w:t>
+        <w:t xml:space="preserve"/>
       </w:r>
       <w:r>
         <w:rPr>
@@ -996,7 +996,7 @@
           <w:sz w:val="32"/>
           <w:szCs w:val="32"/>
         </w:rPr>
-        <w:t>(Academic Director) {{director}}</w:t>
+        <w:t/>
       </w:r>
       <w:r>
         <w:rPr>
@@ -1042,7 +1042,7 @@
           <w:szCs w:val="32"/>
           <w:cs/>
         </w:rPr>
-        <w:t>วันที่</w:t>
+        <w:t/>
       </w:r>
       <w:r>
         <w:rPr>
@@ -1051,7 +1051,7 @@
           <w:szCs w:val="32"/>
           <w:cs/>
         </w:rPr>
-        <w:t xml:space="preserve"> (</w:t>
+        <w:t xml:space="preserve"/>
       </w:r>
       <w:r>
         <w:rPr>
@@ -1059,7 +1059,7 @@
           <w:sz w:val="32"/>
           <w:szCs w:val="32"/>
         </w:rPr>
-        <w:t>Date) {{director_date}}</w:t>
+        <w:t/>
       </w:r>
       <w:r>
         <w:rPr>
@@ -1296,13 +1296,13 @@
           <w:rFonts w:ascii="TH SarabunPSK" w:hAnsi="TH SarabunPSK" w:cs="TH SarabunPSK"/>
           <w:cs/>
         </w:rPr>
-        <w:t>ลงชื่อ</w:t>
-      </w:r>
-      <w:r>
-        <w:rPr>
-          <w:rFonts w:ascii="TH SarabunPSK" w:hAnsi="TH SarabunPSK" w:cs="TH SarabunPSK"/>
-        </w:rPr>
-        <w:t xml:space="preserve"> </w:t>
+        <w:t xml:space="preserve">ลงชื่อ (Signature) {{teacher_sign}}</w:t>
+      </w:r>
+      <w:r>
+        <w:rPr>
+          <w:rFonts w:ascii="TH SarabunPSK" w:hAnsi="TH SarabunPSK" w:cs="TH SarabunPSK"/>
+        </w:rPr>
+        <w:t xml:space="preserve"/>
       </w:r>
       <w:r>
         <w:rPr>
@@ -1310,7 +1310,7 @@
           <w:b w:val="0"/>
           <w:bCs w:val="0"/>
         </w:rPr>
-        <w:t>(Signature)</w:t>
+        <w:t/>
       </w:r>
       <w:r>
         <w:rPr>
@@ -1319,7 +1319,7 @@
           <w:bCs w:val="0"/>
           <w:cs/>
         </w:rPr>
-        <w:t xml:space="preserve"> </w:t>
+        <w:t xml:space="preserve"/>
       </w:r>
       <w:r>
         <w:rPr>
@@ -1327,7 +1327,7 @@
           <w:b w:val="0"/>
           <w:bCs w:val="0"/>
         </w:rPr>
-        <w:t>{{teacher_sign}}</w:t>
+        <w:t/>
       </w:r>
       <w:r>
         <w:rPr>
@@ -1381,7 +1381,7 @@
           <w:bCs w:val="0"/>
           <w:cs/>
         </w:rPr>
-        <w:t xml:space="preserve">  </w:t>
+        <w:t xml:space="preserve">          ({{teacher}})                                   </w:t>
       </w:r>
       <w:r>
         <w:rPr>
@@ -1390,7 +1390,7 @@
           <w:bCs w:val="0"/>
           <w:cs/>
         </w:rPr>
-        <w:t xml:space="preserve">   </w:t>
+        <w:t xml:space="preserve"/>
       </w:r>
       <w:r>
         <w:rPr>
@@ -1399,7 +1399,7 @@
           <w:bCs w:val="0"/>
           <w:cs/>
         </w:rPr>
-        <w:t xml:space="preserve"> </w:t>
+        <w:t xml:space="preserve"/>
       </w:r>
       <w:r>
         <w:rPr>
@@ -1408,7 +1408,7 @@
           <w:bCs w:val="0"/>
           <w:cs/>
         </w:rPr>
-        <w:t xml:space="preserve">  </w:t>
+        <w:t xml:space="preserve"/>
       </w:r>
       <w:r>
         <w:rPr>
@@ -1416,7 +1416,7 @@
           <w:b w:val="0"/>
           <w:bCs w:val="0"/>
         </w:rPr>
-        <w:t xml:space="preserve">  </w:t>
+        <w:t xml:space="preserve"/>
       </w:r>
       <w:r>
         <w:rPr>
@@ -1425,7 +1425,7 @@
           <w:bCs w:val="0"/>
           <w:cs/>
         </w:rPr>
-        <w:t>(</w:t>
+        <w:t/>
       </w:r>
       <w:r>
         <w:rPr>
@@ -1433,7 +1433,7 @@
           <w:b w:val="0"/>
           <w:bCs w:val="0"/>
         </w:rPr>
-        <w:t>{{teacher}}</w:t>
+        <w:t/>
       </w:r>
       <w:r>
         <w:rPr>
@@ -1466,7 +1466,7 @@
           <w:bCs w:val="0"/>
           <w:cs/>
         </w:rPr>
-        <w:t>)</w:t>
+        <w:t/>
       </w:r>
       <w:r>
         <w:rPr>
@@ -1475,7 +1475,7 @@
           <w:bCs w:val="0"/>
           <w:cs/>
         </w:rPr>
-        <w:t xml:space="preserve"> </w:t>
+        <w:t xml:space="preserve"/>
       </w:r>
       <w:r>
         <w:rPr>
@@ -1484,7 +1484,7 @@
           <w:bCs w:val="0"/>
           <w:cs/>
         </w:rPr>
-        <w:t xml:space="preserve">     </w:t>
+        <w:t xml:space="preserve"/>
       </w:r>
       <w:r>
         <w:rPr>
@@ -1493,7 +1493,7 @@
           <w:bCs w:val="0"/>
           <w:cs/>
         </w:rPr>
-        <w:t xml:space="preserve">                             </w:t>
+        <w:t xml:space="preserve"/>
       </w:r>
     </w:p>
     <w:p>
@@ -2786,7 +2786,7 @@
           <w:szCs w:val="36"/>
           <w:cs/>
         </w:rPr>
-        <w:t xml:space="preserve">หน่วยที่ 1  </w:t>
+        <w:t xml:space="preserve">หน่วยที่ 1  {{unit_1_title}}ผร. </w:t>
       </w:r>
       <w:r>
         <w:rPr>
@@ -2796,7 +2796,7 @@
           <w:sz w:val="36"/>
           <w:szCs w:val="36"/>
         </w:rPr>
-        <w:t>{{unit_1_title}}</w:t>
+        <w:t/>
       </w:r>
       <w:r>
         <w:rPr>
@@ -2837,7 +2837,7 @@
           <w:szCs w:val="36"/>
           <w:cs/>
         </w:rPr>
-        <w:t>ผร.</w:t>
+        <w:t/>
       </w:r>
       <w:r>
         <w:rPr>
@@ -2847,7 +2847,7 @@
           <w:sz w:val="36"/>
           <w:szCs w:val="36"/>
         </w:rPr>
-        <w:t xml:space="preserve"> </w:t>
+        <w:t xml:space="preserve"/>
       </w:r>
     </w:p>
     <w:p>
@@ -2870,7 +2870,7 @@
           <w:szCs w:val="36"/>
           <w:cs/>
         </w:rPr>
-        <w:t xml:space="preserve">หน่วยที่ 2  </w:t>
+        <w:t xml:space="preserve">หน่วยที่ 2  {{unit_2_title}}ผร. </w:t>
       </w:r>
       <w:r>
         <w:rPr>
@@ -2880,7 +2880,7 @@
           <w:sz w:val="36"/>
           <w:szCs w:val="36"/>
         </w:rPr>
-        <w:t>{{unit_2_title}}</w:t>
+        <w:t/>
       </w:r>
       <w:r>
         <w:rPr>
@@ -2922,7 +2922,7 @@
           <w:szCs w:val="36"/>
           <w:cs/>
         </w:rPr>
-        <w:t>ผร.</w:t>
+        <w:t/>
       </w:r>
       <w:r>
         <w:rPr>
@@ -2932,7 +2932,7 @@
           <w:sz w:val="36"/>
           <w:szCs w:val="36"/>
         </w:rPr>
-        <w:t xml:space="preserve"> </w:t>
+        <w:t xml:space="preserve"/>
       </w:r>
     </w:p>
     <w:p>
@@ -2955,7 +2955,7 @@
           <w:szCs w:val="36"/>
           <w:cs/>
         </w:rPr>
-        <w:t xml:space="preserve">หน่วยที่ 3  </w:t>
+        <w:t xml:space="preserve">หน่วยที่ 3  {{unit_3_title}}ผร. </w:t>
       </w:r>
       <w:r>
         <w:rPr>
@@ -2965,7 +2965,7 @@
           <w:sz w:val="36"/>
           <w:szCs w:val="36"/>
         </w:rPr>
-        <w:t>{{unit_3_title}}</w:t>
+        <w:t/>
       </w:r>
       <w:r>
         <w:rPr>
@@ -3008,7 +3008,7 @@
           <w:szCs w:val="36"/>
           <w:cs/>
         </w:rPr>
-        <w:t>ผร.</w:t>
+        <w:t/>
       </w:r>
       <w:r>
         <w:rPr>
@@ -3018,7 +3018,7 @@
           <w:sz w:val="36"/>
           <w:szCs w:val="36"/>
         </w:rPr>
-        <w:t xml:space="preserve"> </w:t>
+        <w:t xml:space="preserve"/>
       </w:r>
     </w:p>
     <w:p>
@@ -3041,7 +3041,7 @@
           <w:szCs w:val="36"/>
           <w:cs/>
         </w:rPr>
-        <w:t xml:space="preserve">หน่วยที่ 4  </w:t>
+        <w:t xml:space="preserve">หน่วยที่ 4  {{unit_4_title}}ผร. </w:t>
       </w:r>
       <w:r>
         <w:rPr>
@@ -3051,7 +3051,7 @@
           <w:sz w:val="36"/>
           <w:szCs w:val="36"/>
         </w:rPr>
-        <w:t>{{unit_4_title}}</w:t>
+        <w:t/>
       </w:r>
       <w:r>
         <w:rPr>
@@ -3094,7 +3094,7 @@
           <w:szCs w:val="36"/>
           <w:cs/>
         </w:rPr>
-        <w:t>ผร.</w:t>
+        <w:t/>
       </w:r>
       <w:r>
         <w:rPr>
@@ -3104,7 +3104,7 @@
           <w:sz w:val="36"/>
           <w:szCs w:val="36"/>
         </w:rPr>
-        <w:t xml:space="preserve"> </w:t>
+        <w:t xml:space="preserve"/>
       </w:r>
     </w:p>
     <w:p>
@@ -3127,7 +3127,7 @@
           <w:szCs w:val="36"/>
           <w:cs/>
         </w:rPr>
-        <w:t>หน่วยที่ 5</w:t>
+        <w:t xml:space="preserve">หน่วยที่ 5  {{unit_5_title}}ผร. </w:t>
       </w:r>
       <w:r>
         <w:rPr>
@@ -3138,7 +3138,7 @@
           <w:szCs w:val="36"/>
           <w:cs/>
         </w:rPr>
-        <w:t xml:space="preserve">  </w:t>
+        <w:t xml:space="preserve"/>
       </w:r>
       <w:r>
         <w:rPr>
@@ -3148,7 +3148,7 @@
           <w:sz w:val="36"/>
           <w:szCs w:val="36"/>
         </w:rPr>
-        <w:t>{{unit_5_title}}</w:t>
+        <w:t/>
       </w:r>
       <w:r>
         <w:rPr>
@@ -3192,7 +3192,7 @@
           <w:szCs w:val="36"/>
           <w:cs/>
         </w:rPr>
-        <w:t>ผร.</w:t>
+        <w:t/>
       </w:r>
       <w:r>
         <w:rPr>
@@ -3202,7 +3202,7 @@
           <w:sz w:val="36"/>
           <w:szCs w:val="36"/>
         </w:rPr>
-        <w:t xml:space="preserve"> </w:t>
+        <w:t xml:space="preserve"/>
       </w:r>
     </w:p>
     <w:p>
@@ -3225,7 +3225,7 @@
           <w:szCs w:val="36"/>
           <w:cs/>
         </w:rPr>
-        <w:t xml:space="preserve">หน่วยที่ 6  </w:t>
+        <w:t xml:space="preserve">หน่วยที่ 6  {{unit_6_title}}ผร. </w:t>
       </w:r>
       <w:r>
         <w:rPr>
@@ -3235,7 +3235,7 @@
           <w:sz w:val="36"/>
           <w:szCs w:val="36"/>
         </w:rPr>
-        <w:t>{{unit_6_title}}</w:t>
+        <w:t/>
       </w:r>
       <w:r>
         <w:rPr>
@@ -3269,7 +3269,7 @@
           <w:cs/>
         </w:rPr>
         <w:tab/>
-        <w:t>ผร.</w:t>
+        <w:t/>
       </w:r>
       <w:r>
         <w:rPr>
@@ -3279,7 +3279,7 @@
           <w:sz w:val="36"/>
           <w:szCs w:val="36"/>
         </w:rPr>
-        <w:t xml:space="preserve"> </w:t>
+        <w:t xml:space="preserve"/>
       </w:r>
     </w:p>
     <w:p>
@@ -3302,7 +3302,7 @@
           <w:szCs w:val="36"/>
           <w:cs/>
         </w:rPr>
-        <w:t>หน่วยที่ 7</w:t>
+        <w:t xml:space="preserve">หน่วยที่ 7  {{unit_7_title}}ผร. </w:t>
       </w:r>
       <w:r>
         <w:rPr>
@@ -3313,7 +3313,7 @@
           <w:szCs w:val="36"/>
           <w:cs/>
         </w:rPr>
-        <w:t xml:space="preserve">  </w:t>
+        <w:t xml:space="preserve"/>
       </w:r>
       <w:r>
         <w:rPr>
@@ -3323,7 +3323,7 @@
           <w:sz w:val="36"/>
           <w:szCs w:val="36"/>
         </w:rPr>
-        <w:t>{{unit_7_title}}</w:t>
+        <w:t/>
       </w:r>
       <w:r>
         <w:rPr>
@@ -3367,7 +3367,7 @@
           <w:szCs w:val="36"/>
           <w:cs/>
         </w:rPr>
-        <w:t>ผร.</w:t>
+        <w:t/>
       </w:r>
       <w:r>
         <w:rPr>
@@ -3377,7 +3377,7 @@
           <w:sz w:val="36"/>
           <w:szCs w:val="36"/>
         </w:rPr>
-        <w:t xml:space="preserve"> </w:t>
+        <w:t xml:space="preserve"/>
       </w:r>
     </w:p>
     <w:p>
@@ -3400,7 +3400,7 @@
           <w:szCs w:val="36"/>
           <w:cs/>
         </w:rPr>
-        <w:t xml:space="preserve">หน่วยที่ 8  </w:t>
+        <w:t xml:space="preserve">หน่วยที่ 8  {{unit_8_title}}ผร. </w:t>
       </w:r>
       <w:r>
         <w:rPr>
@@ -3410,7 +3410,7 @@
           <w:sz w:val="36"/>
           <w:szCs w:val="36"/>
         </w:rPr>
-        <w:t>{{unit_8_title}}</w:t>
+        <w:t/>
       </w:r>
       <w:r>
         <w:rPr>
@@ -3444,7 +3444,7 @@
           <w:cs/>
         </w:rPr>
         <w:tab/>
-        <w:t>ผร.</w:t>
+        <w:t/>
       </w:r>
       <w:r>
         <w:rPr>
@@ -3454,7 +3454,7 @@
           <w:sz w:val="36"/>
           <w:szCs w:val="36"/>
         </w:rPr>
-        <w:t xml:space="preserve"> </w:t>
+        <w:t xml:space="preserve"/>
       </w:r>
     </w:p>
     <w:p>
@@ -3477,7 +3477,7 @@
           <w:szCs w:val="36"/>
           <w:cs/>
         </w:rPr>
-        <w:t>หน่วยที่ 9</w:t>
+        <w:t xml:space="preserve">หน่วยที่ 9  {{unit_9_title}}ผร. </w:t>
       </w:r>
       <w:r>
         <w:rPr>
@@ -3488,7 +3488,7 @@
           <w:szCs w:val="36"/>
           <w:cs/>
         </w:rPr>
-        <w:t xml:space="preserve">  </w:t>
+        <w:t xml:space="preserve"/>
       </w:r>
       <w:r>
         <w:rPr>
@@ -3498,7 +3498,7 @@
           <w:sz w:val="36"/>
           <w:szCs w:val="36"/>
         </w:rPr>
-        <w:t>{{unit_9_title}}</w:t>
+        <w:t/>
       </w:r>
       <w:r>
         <w:rPr>
@@ -3539,7 +3539,7 @@
           <w:szCs w:val="36"/>
           <w:cs/>
         </w:rPr>
-        <w:t>ผร.</w:t>
+        <w:t/>
       </w:r>
       <w:r>
         <w:rPr>
@@ -3549,7 +3549,7 @@
           <w:sz w:val="36"/>
           <w:szCs w:val="36"/>
         </w:rPr>
-        <w:t xml:space="preserve"> </w:t>
+        <w:t xml:space="preserve"/>
       </w:r>
     </w:p>
     <w:p>
@@ -3572,7 +3572,7 @@
           <w:szCs w:val="36"/>
           <w:cs/>
         </w:rPr>
-        <w:t>หน่วยที่ 10</w:t>
+        <w:t xml:space="preserve">หน่วยที่ 10  {{unit_10_title}}ผร. </w:t>
       </w:r>
       <w:r>
         <w:rPr>
@@ -3583,7 +3583,7 @@
           <w:szCs w:val="36"/>
           <w:cs/>
         </w:rPr>
-        <w:t xml:space="preserve">  </w:t>
+        <w:t xml:space="preserve"/>
       </w:r>
       <w:r>
         <w:rPr>
@@ -3593,7 +3593,7 @@
           <w:sz w:val="36"/>
           <w:szCs w:val="36"/>
         </w:rPr>
-        <w:t>{{unit_10_title}}</w:t>
+        <w:t/>
       </w:r>
       <w:r>
         <w:rPr>
@@ -3646,7 +3646,7 @@
           <w:szCs w:val="36"/>
           <w:cs/>
         </w:rPr>
-        <w:t>ผร.</w:t>
+        <w:t/>
       </w:r>
       <w:r>
         <w:rPr>
@@ -3656,7 +3656,7 @@
           <w:sz w:val="36"/>
           <w:szCs w:val="36"/>
         </w:rPr>
-        <w:t xml:space="preserve"> </w:t>
+        <w:t xml:space="preserve"/>
       </w:r>
     </w:p>
     <w:p>
@@ -3894,7 +3894,7 @@
           <w:szCs w:val="32"/>
           <w:cs/>
         </w:rPr>
-        <w:t>หลักสูตร{{curriculum}}</w:t>
+        <w:t xml:space="preserve">หลักสูตร{{curriculum}}</w:t>
       </w:r>
       <w:r>
         <w:rPr>
@@ -3928,7 +3928,7 @@
           <w:szCs w:val="32"/>
           <w:cs/>
         </w:rPr>
-        <w:t>ประเภทวิชา {{category}} กลุ่มอาชีพ {{career_group}} สาขาวิชา {{program}}</w:t>
+        <w:t xml:space="preserve">ประเภทวิชา {{category}} กลุ่มอาชีพ {{career_group}} สาขาวิชา {{program}}</w:t>
       </w:r>
       <w:r>
         <w:rPr>
@@ -4066,7 +4066,7 @@
           <w:szCs w:val="32"/>
           <w:cs/>
         </w:rPr>
-        <w:t>รหัส</w:t>
+        <w:t xml:space="preserve">รหัส และ ชื่อวิชา (Subject Code &amp; Name)  {{course_label}}</w:t>
       </w:r>
       <w:r>
         <w:rPr>
@@ -4077,7 +4077,7 @@
           <w:szCs w:val="32"/>
           <w:cs/>
         </w:rPr>
-        <w:t xml:space="preserve"> </w:t>
+        <w:t xml:space="preserve"/>
       </w:r>
       <w:r>
         <w:rPr>
@@ -4088,7 +4088,7 @@
           <w:szCs w:val="32"/>
           <w:cs/>
         </w:rPr>
-        <w:t>และ</w:t>
+        <w:t/>
       </w:r>
       <w:r>
         <w:rPr>
@@ -4099,7 +4099,7 @@
           <w:szCs w:val="32"/>
           <w:cs/>
         </w:rPr>
-        <w:t xml:space="preserve"> </w:t>
+        <w:t xml:space="preserve"/>
       </w:r>
       <w:r>
         <w:rPr>
@@ -4110,7 +4110,7 @@
           <w:szCs w:val="32"/>
           <w:cs/>
         </w:rPr>
-        <w:t>ชื่อวิชา</w:t>
+        <w:t/>
       </w:r>
       <w:r>
         <w:rPr>
@@ -4119,25 +4119,25 @@
           <w:szCs w:val="24"/>
           <w:cs/>
         </w:rPr>
-        <w:t xml:space="preserve"> </w:t>
-      </w:r>
-      <w:r>
-        <w:rPr>
-          <w:rFonts w:ascii="TH SarabunPSK" w:hAnsi="TH SarabunPSK" w:cs="TH SarabunPSK"/>
-        </w:rPr>
-        <w:t>(</w:t>
-      </w:r>
-      <w:r>
-        <w:rPr>
-          <w:rFonts w:ascii="TH SarabunPSK" w:hAnsi="TH SarabunPSK" w:cs="TH SarabunPSK"/>
-        </w:rPr>
-        <w:t>Subject Code &amp; Name</w:t>
-      </w:r>
-      <w:r>
-        <w:rPr>
-          <w:rFonts w:ascii="TH SarabunPSK" w:hAnsi="TH SarabunPSK" w:cs="TH SarabunPSK"/>
-        </w:rPr>
-        <w:t>)</w:t>
+        <w:t xml:space="preserve"/>
+      </w:r>
+      <w:r>
+        <w:rPr>
+          <w:rFonts w:ascii="TH SarabunPSK" w:hAnsi="TH SarabunPSK" w:cs="TH SarabunPSK"/>
+        </w:rPr>
+        <w:t/>
+      </w:r>
+      <w:r>
+        <w:rPr>
+          <w:rFonts w:ascii="TH SarabunPSK" w:hAnsi="TH SarabunPSK" w:cs="TH SarabunPSK"/>
+        </w:rPr>
+        <w:t/>
+      </w:r>
+      <w:r>
+        <w:rPr>
+          <w:rFonts w:ascii="TH SarabunPSK" w:hAnsi="TH SarabunPSK" w:cs="TH SarabunPSK"/>
+        </w:rPr>
+        <w:t/>
       </w:r>
       <w:r>
         <w:rPr>
@@ -4147,7 +4147,7 @@
           <w:sz w:val="32"/>
           <w:szCs w:val="32"/>
         </w:rPr>
-        <w:t xml:space="preserve"> </w:t>
+        <w:t xml:space="preserve"/>
       </w:r>
       <w:r>
         <w:rPr>
@@ -4156,7 +4156,7 @@
           <w:szCs w:val="32"/>
           <w:cs/>
         </w:rPr>
-        <w:t xml:space="preserve"> </w:t>
+        <w:t xml:space="preserve"/>
       </w:r>
       <w:r>
         <w:rPr>
@@ -4165,7 +4165,7 @@
           <w:szCs w:val="32"/>
           <w:cs/>
         </w:rPr>
-        <w:t>{{course_label}}</w:t>
+        <w:t/>
       </w:r>
       <w:r>
         <w:rPr>
@@ -4221,7 +4221,7 @@
           <w:szCs w:val="32"/>
           <w:cs/>
         </w:rPr>
-        <w:t>หน่วยกิต</w:t>
+        <w:t xml:space="preserve">หน่วยกิต (ชั่วโมง) Credit (Hours) {{credits}} ({{weekly_hours}}) เวลาเรียนต่อภาค (Total Hours per Semester) {{semester_hours}} ชั่วโมง (hours)</w:t>
       </w:r>
       <w:r>
         <w:rPr>
@@ -4230,7 +4230,7 @@
           <w:bCs/>
           <w:cs/>
         </w:rPr>
-        <w:t xml:space="preserve"> (ชั่วโมง)</w:t>
+        <w:t xml:space="preserve"/>
       </w:r>
       <w:r>
         <w:rPr>
@@ -4239,13 +4239,13 @@
           <w:bCs/>
           <w:cs/>
         </w:rPr>
-        <w:t xml:space="preserve"> </w:t>
-      </w:r>
-      <w:r>
-        <w:rPr>
-          <w:rFonts w:ascii="TH SarabunPSK" w:hAnsi="TH SarabunPSK" w:cs="TH SarabunPSK"/>
-        </w:rPr>
-        <w:t>Credit (Hours)</w:t>
+        <w:t xml:space="preserve"/>
+      </w:r>
+      <w:r>
+        <w:rPr>
+          <w:rFonts w:ascii="TH SarabunPSK" w:hAnsi="TH SarabunPSK" w:cs="TH SarabunPSK"/>
+        </w:rPr>
+        <w:t/>
       </w:r>
       <w:r>
         <w:rPr>
@@ -4256,7 +4256,7 @@
           <w:szCs w:val="32"/>
           <w:cs/>
         </w:rPr>
-        <w:t xml:space="preserve"> </w:t>
+        <w:t xml:space="preserve"/>
       </w:r>
       <w:r>
         <w:rPr>
@@ -4265,7 +4265,7 @@
           <w:szCs w:val="32"/>
           <w:cs/>
         </w:rPr>
-        <w:t>{{credits}}</w:t>
+        <w:t/>
       </w:r>
       <w:r>
         <w:rPr>
@@ -4274,7 +4274,7 @@
           <w:szCs w:val="32"/>
           <w:cs/>
         </w:rPr>
-        <w:t xml:space="preserve"> </w:t>
+        <w:t xml:space="preserve"/>
       </w:r>
       <w:r>
         <w:rPr>
@@ -4283,7 +4283,7 @@
           <w:szCs w:val="32"/>
           <w:cs/>
         </w:rPr>
-        <w:t>(</w:t>
+        <w:t/>
       </w:r>
       <w:r>
         <w:rPr>
@@ -4292,7 +4292,7 @@
           <w:szCs w:val="32"/>
           <w:cs/>
         </w:rPr>
-        <w:t>{{weekly_hours}}</w:t>
+        <w:t/>
       </w:r>
       <w:r>
         <w:rPr>
@@ -4301,7 +4301,7 @@
           <w:szCs w:val="32"/>
           <w:cs/>
         </w:rPr>
-        <w:t>)</w:t>
+        <w:t/>
       </w:r>
       <w:r>
         <w:rPr>
@@ -4312,7 +4312,7 @@
           <w:szCs w:val="32"/>
           <w:cs/>
         </w:rPr>
-        <w:t xml:space="preserve"> </w:t>
+        <w:t xml:space="preserve"/>
       </w:r>
       <w:r>
         <w:rPr>
@@ -4323,7 +4323,7 @@
           <w:szCs w:val="32"/>
           <w:cs/>
         </w:rPr>
-        <w:t>เวลาเรียนต่อภาค</w:t>
+        <w:t/>
       </w:r>
       <w:r>
         <w:rPr>
@@ -4331,25 +4331,25 @@
           <w:sz w:val="24"/>
           <w:szCs w:val="24"/>
         </w:rPr>
-        <w:t xml:space="preserve"> </w:t>
-      </w:r>
-      <w:r>
-        <w:rPr>
-          <w:rFonts w:ascii="TH SarabunPSK" w:hAnsi="TH SarabunPSK" w:cs="TH SarabunPSK"/>
-        </w:rPr>
-        <w:t>(</w:t>
-      </w:r>
-      <w:r>
-        <w:rPr>
-          <w:rFonts w:ascii="TH SarabunPSK" w:hAnsi="TH SarabunPSK" w:cs="TH SarabunPSK"/>
-        </w:rPr>
-        <w:t>Total Hours per Semester</w:t>
-      </w:r>
-      <w:r>
-        <w:rPr>
-          <w:rFonts w:ascii="TH SarabunPSK" w:hAnsi="TH SarabunPSK" w:cs="TH SarabunPSK"/>
-        </w:rPr>
-        <w:t>)</w:t>
+        <w:t xml:space="preserve"/>
+      </w:r>
+      <w:r>
+        <w:rPr>
+          <w:rFonts w:ascii="TH SarabunPSK" w:hAnsi="TH SarabunPSK" w:cs="TH SarabunPSK"/>
+        </w:rPr>
+        <w:t/>
+      </w:r>
+      <w:r>
+        <w:rPr>
+          <w:rFonts w:ascii="TH SarabunPSK" w:hAnsi="TH SarabunPSK" w:cs="TH SarabunPSK"/>
+        </w:rPr>
+        <w:t/>
+      </w:r>
+      <w:r>
+        <w:rPr>
+          <w:rFonts w:ascii="TH SarabunPSK" w:hAnsi="TH SarabunPSK" w:cs="TH SarabunPSK"/>
+        </w:rPr>
+        <w:t/>
       </w:r>
       <w:r>
         <w:rPr>
@@ -4359,7 +4359,7 @@
           <w:sz w:val="32"/>
           <w:szCs w:val="32"/>
         </w:rPr>
-        <w:t xml:space="preserve"> </w:t>
+        <w:t xml:space="preserve"/>
       </w:r>
       <w:r>
         <w:rPr>
@@ -4368,7 +4368,7 @@
           <w:szCs w:val="32"/>
           <w:cs/>
         </w:rPr>
-        <w:t>{{semester_hours}}</w:t>
+        <w:t/>
       </w:r>
       <w:r>
         <w:rPr>
@@ -4385,7 +4385,7 @@
           <w:sz w:val="32"/>
           <w:szCs w:val="32"/>
         </w:rPr>
-        <w:t xml:space="preserve"> </w:t>
+        <w:t xml:space="preserve"/>
       </w:r>
       <w:r>
         <w:rPr>
@@ -4396,7 +4396,7 @@
           <w:szCs w:val="32"/>
           <w:cs/>
         </w:rPr>
-        <w:t>ชั่วโมง</w:t>
+        <w:t/>
       </w:r>
       <w:r>
         <w:rPr>
@@ -4404,13 +4404,13 @@
           <w:sz w:val="24"/>
           <w:szCs w:val="24"/>
         </w:rPr>
-        <w:t xml:space="preserve"> </w:t>
-      </w:r>
-      <w:r>
-        <w:rPr>
-          <w:rFonts w:ascii="TH SarabunPSK" w:hAnsi="TH SarabunPSK" w:cs="TH SarabunPSK"/>
-        </w:rPr>
-        <w:t>(hours)</w:t>
+        <w:t xml:space="preserve"/>
+      </w:r>
+      <w:r>
+        <w:rPr>
+          <w:rFonts w:ascii="TH SarabunPSK" w:hAnsi="TH SarabunPSK" w:cs="TH SarabunPSK"/>
+        </w:rPr>
+        <w:t/>
       </w:r>
     </w:p>
     <w:p>
@@ -4588,7 +4588,7 @@
                 <w:rFonts w:ascii="TH SarabunPSK" w:hAnsi="TH SarabunPSK" w:cs="TH SarabunPSK" w:hint="cs"/>
                 <w:cs/>
               </w:rPr>
-              <w:t>{{curriculum_standards}}</w:t>
+              <w:t xml:space="preserve">{{curriculum_standards}}</w:t>
             </w:r>
           </w:p>
           <w:p>
@@ -4681,7 +4681,7 @@
               <w:rPr>
                 <w:rFonts w:ascii="TH SarabunPSK" w:hAnsi="TH SarabunPSK" w:cs="TH SarabunPSK"/>
               </w:rPr>
-              <w:t>{{course_learning_outcomes}}</w:t>
+              <w:t xml:space="preserve">{{course_learning_outcomes}}</w:t>
             </w:r>
             <w:r>
               <w:rPr>
@@ -4796,14 +4796,14 @@
                 <w:rFonts w:ascii="TH SarabunPSK" w:hAnsi="TH SarabunPSK" w:cs="TH SarabunPSK" w:hint="cs"/>
                 <w:cs/>
               </w:rPr>
-              <w:t>{{course_objectives}}</w:t>
-            </w:r>
-            <w:r>
-              <w:rPr>
-                <w:rFonts w:ascii="TH SarabunPSK" w:hAnsi="TH SarabunPSK" w:cs="TH SarabunPSK"/>
-                <w:cs/>
-              </w:rPr>
-              <w:t xml:space="preserve"> </w:t>
+              <w:t xml:space="preserve">{{course_objectives}} </w:t>
+            </w:r>
+            <w:r>
+              <w:rPr>
+                <w:rFonts w:ascii="TH SarabunPSK" w:hAnsi="TH SarabunPSK" w:cs="TH SarabunPSK"/>
+                <w:cs/>
+              </w:rPr>
+              <w:t xml:space="preserve"/>
             </w:r>
           </w:p>
           <w:p>
@@ -4841,7 +4841,7 @@
                 <w:rFonts w:ascii="TH SarabunPSK" w:hAnsi="TH SarabunPSK" w:cs="TH SarabunPSK" w:hint="cs"/>
                 <w:cs/>
               </w:rPr>
-              <w:t>{{course_competencies}}</w:t>
+              <w:t xml:space="preserve">{{course_competencies}}มาตรฐานรายวิชา (Vocational  Standard) </w:t>
             </w:r>
             <w:r>
               <w:rPr>
@@ -4852,14 +4852,14 @@
                 <w:szCs w:val="32"/>
                 <w:cs/>
               </w:rPr>
-              <w:t>มาตรฐานรายวิชา</w:t>
-            </w:r>
-            <w:r>
-              <w:rPr>
-                <w:rFonts w:ascii="TH SarabunPSK" w:hAnsi="TH SarabunPSK" w:cs="TH SarabunPSK"/>
-                <w:cs/>
-              </w:rPr>
-              <w:t xml:space="preserve"> </w:t>
+              <w:t/>
+            </w:r>
+            <w:r>
+              <w:rPr>
+                <w:rFonts w:ascii="TH SarabunPSK" w:hAnsi="TH SarabunPSK" w:cs="TH SarabunPSK"/>
+                <w:cs/>
+              </w:rPr>
+              <w:t xml:space="preserve"/>
             </w:r>
             <w:r>
               <w:rPr>
@@ -4867,7 +4867,7 @@
                 <w:sz w:val="32"/>
                 <w:szCs w:val="32"/>
               </w:rPr>
-              <w:t>(Vo</w:t>
+              <w:t/>
             </w:r>
             <w:r>
               <w:rPr>
@@ -4875,7 +4875,7 @@
                 <w:sz w:val="32"/>
                 <w:szCs w:val="32"/>
               </w:rPr>
-              <w:t>c</w:t>
+              <w:t/>
             </w:r>
             <w:r>
               <w:rPr>
@@ -4883,7 +4883,7 @@
                 <w:sz w:val="32"/>
                 <w:szCs w:val="32"/>
               </w:rPr>
-              <w:t>a</w:t>
+              <w:t/>
             </w:r>
             <w:r>
               <w:rPr>
@@ -4891,7 +4891,7 @@
                 <w:sz w:val="32"/>
                 <w:szCs w:val="32"/>
               </w:rPr>
-              <w:t xml:space="preserve">tional </w:t>
+              <w:t xml:space="preserve"/>
             </w:r>
             <w:r>
               <w:rPr>
@@ -4899,7 +4899,7 @@
                 <w:sz w:val="32"/>
                 <w:szCs w:val="32"/>
               </w:rPr>
-              <w:t xml:space="preserve"> Stand</w:t>
+              <w:t xml:space="preserve"/>
             </w:r>
             <w:r>
               <w:rPr>
@@ -4907,7 +4907,7 @@
                 <w:sz w:val="32"/>
                 <w:szCs w:val="32"/>
               </w:rPr>
-              <w:t>a</w:t>
+              <w:t/>
             </w:r>
             <w:r>
               <w:rPr>
@@ -4915,7 +4915,7 @@
                 <w:sz w:val="32"/>
                 <w:szCs w:val="32"/>
               </w:rPr>
-              <w:t xml:space="preserve">rd) </w:t>
+              <w:t xml:space="preserve"/>
             </w:r>
           </w:p>
           <w:p>
@@ -5005,7 +5005,7 @@
                 <w:szCs w:val="28"/>
                 <w:cs/>
               </w:rPr>
-              <w:t>{{course_description}}</w:t>
+              <w:t xml:space="preserve">{{course_description}}คำอธิบายรายวิชา (Course Description)</w:t>
             </w:r>
             <w:r>
               <w:rPr>
@@ -5016,13 +5016,13 @@
                 <w:szCs w:val="32"/>
                 <w:cs/>
               </w:rPr>
-              <w:t>คำอธิบายรายวิชา</w:t>
-            </w:r>
-            <w:r>
-              <w:rPr>
-                <w:rFonts w:ascii="TH SarabunPSK" w:hAnsi="TH SarabunPSK" w:cs="TH SarabunPSK"/>
-              </w:rPr>
-              <w:t xml:space="preserve"> </w:t>
+              <w:t/>
+            </w:r>
+            <w:r>
+              <w:rPr>
+                <w:rFonts w:ascii="TH SarabunPSK" w:hAnsi="TH SarabunPSK" w:cs="TH SarabunPSK"/>
+              </w:rPr>
+              <w:t xml:space="preserve"/>
             </w:r>
             <w:r>
               <w:rPr>
@@ -5030,7 +5030,7 @@
                 <w:sz w:val="32"/>
                 <w:szCs w:val="36"/>
               </w:rPr>
-              <w:t>(Course Description)</w:t>
+              <w:t/>
             </w:r>
           </w:p>
           <w:p>
@@ -5190,7 +5190,7 @@
           <w:szCs w:val="32"/>
           <w:cs/>
         </w:rPr>
-        <w:t>หน่วยงานรับรองมาตรฐานอาชีพ</w:t>
+        <w:t xml:space="preserve">หน่วยงานรับรองมาตรฐานอาชีพ (Occupational Standards Certifying Agency) {{standard_agency}}</w:t>
       </w:r>
       <w:r>
         <w:rPr>
@@ -5201,27 +5201,27 @@
           <w:szCs w:val="32"/>
           <w:cs/>
         </w:rPr>
-        <w:t xml:space="preserve"> </w:t>
+        <w:t xml:space="preserve"/>
       </w:r>
       <w:r>
         <w:rPr>
           <w:rFonts w:ascii="TH SarabunPSK" w:hAnsi="TH SarabunPSK" w:cs="TH SarabunPSK" w:hint="cs"/>
           <w:cs/>
         </w:rPr>
-        <w:t>(</w:t>
-      </w:r>
-      <w:r>
-        <w:rPr>
-          <w:rFonts w:ascii="TH SarabunPSK" w:hAnsi="TH SarabunPSK" w:cs="TH SarabunPSK"/>
-        </w:rPr>
-        <w:t>Occupational Standards Certifying Agency</w:t>
+        <w:t/>
+      </w:r>
+      <w:r>
+        <w:rPr>
+          <w:rFonts w:ascii="TH SarabunPSK" w:hAnsi="TH SarabunPSK" w:cs="TH SarabunPSK"/>
+        </w:rPr>
+        <w:t/>
       </w:r>
       <w:r>
         <w:rPr>
           <w:rFonts w:ascii="TH SarabunPSK" w:hAnsi="TH SarabunPSK" w:cs="TH SarabunPSK" w:hint="cs"/>
           <w:cs/>
         </w:rPr>
-        <w:t xml:space="preserve">) </w:t>
+        <w:t xml:space="preserve"/>
       </w:r>
       <w:r>
         <w:rPr>
@@ -5232,7 +5232,7 @@
           <w:szCs w:val="32"/>
           <w:cs/>
         </w:rPr>
-        <w:t>{{standard_agency}}</w:t>
+        <w:t/>
       </w:r>
       <w:r>
         <w:rPr>
@@ -5277,7 +5277,7 @@
           <w:szCs w:val="32"/>
           <w:cs/>
         </w:rPr>
-        <w:t>มาตรฐานอาชีพ  สาขาวิชาชีพ</w:t>
+        <w:t xml:space="preserve">มาตรฐานอาชีพ  สาขาวิชาชีพ (Occupational Standards by Field of Study) {{occupational_standard_field}}</w:t>
       </w:r>
       <w:r>
         <w:rPr>
@@ -5287,27 +5287,27 @@
           <w:sz w:val="32"/>
           <w:szCs w:val="32"/>
         </w:rPr>
-        <w:t xml:space="preserve"> </w:t>
+        <w:t xml:space="preserve"/>
       </w:r>
       <w:r>
         <w:rPr>
           <w:rFonts w:ascii="TH SarabunPSK" w:hAnsi="TH SarabunPSK" w:cs="TH SarabunPSK" w:hint="cs"/>
           <w:cs/>
         </w:rPr>
-        <w:t>(</w:t>
-      </w:r>
-      <w:r>
-        <w:rPr>
-          <w:rFonts w:ascii="TH SarabunPSK" w:hAnsi="TH SarabunPSK" w:cs="TH SarabunPSK"/>
-        </w:rPr>
-        <w:t>Occupational Standards by Field of Study</w:t>
+        <w:t/>
+      </w:r>
+      <w:r>
+        <w:rPr>
+          <w:rFonts w:ascii="TH SarabunPSK" w:hAnsi="TH SarabunPSK" w:cs="TH SarabunPSK"/>
+        </w:rPr>
+        <w:t/>
       </w:r>
       <w:r>
         <w:rPr>
           <w:rFonts w:ascii="TH SarabunPSK" w:hAnsi="TH SarabunPSK" w:cs="TH SarabunPSK" w:hint="cs"/>
           <w:cs/>
         </w:rPr>
-        <w:t xml:space="preserve">) </w:t>
+        <w:t xml:space="preserve"/>
       </w:r>
       <w:r>
         <w:rPr>
@@ -5318,7 +5318,7 @@
           <w:szCs w:val="32"/>
           <w:cs/>
         </w:rPr>
-        <w:t>{{occupational_standard_field}}</w:t>
+        <w:t/>
       </w:r>
       <w:r>
         <w:rPr>
@@ -5383,7 +5383,7 @@
           <w:szCs w:val="32"/>
           <w:cs/>
         </w:rPr>
-        <w:t>อาชีพ</w:t>
+        <w:t xml:space="preserve">อาชีพ (Sector) {{occupation_sector}}ระดับ (Level) {{occupational_level}}</w:t>
       </w:r>
       <w:r>
         <w:rPr>
@@ -5394,27 +5394,27 @@
           <w:szCs w:val="32"/>
           <w:cs/>
         </w:rPr>
-        <w:t xml:space="preserve"> </w:t>
+        <w:t xml:space="preserve"/>
       </w:r>
       <w:r>
         <w:rPr>
           <w:rFonts w:ascii="TH SarabunPSK" w:hAnsi="TH SarabunPSK" w:cs="TH SarabunPSK" w:hint="cs"/>
           <w:cs/>
         </w:rPr>
-        <w:t>(</w:t>
-      </w:r>
-      <w:r>
-        <w:rPr>
-          <w:rFonts w:ascii="TH SarabunPSK" w:hAnsi="TH SarabunPSK" w:cs="TH SarabunPSK"/>
-        </w:rPr>
-        <w:t>Sector</w:t>
+        <w:t/>
+      </w:r>
+      <w:r>
+        <w:rPr>
+          <w:rFonts w:ascii="TH SarabunPSK" w:hAnsi="TH SarabunPSK" w:cs="TH SarabunPSK"/>
+        </w:rPr>
+        <w:t/>
       </w:r>
       <w:r>
         <w:rPr>
           <w:rFonts w:ascii="TH SarabunPSK" w:hAnsi="TH SarabunPSK" w:cs="TH SarabunPSK" w:hint="cs"/>
           <w:cs/>
         </w:rPr>
-        <w:t xml:space="preserve">) </w:t>
+        <w:t xml:space="preserve"/>
       </w:r>
       <w:r>
         <w:rPr>
@@ -5425,7 +5425,7 @@
           <w:szCs w:val="32"/>
           <w:cs/>
         </w:rPr>
-        <w:t>{{occupation_sector}}ระดับ</w:t>
+        <w:t/>
       </w:r>
       <w:r>
         <w:rPr>
@@ -5436,27 +5436,27 @@
           <w:szCs w:val="32"/>
           <w:cs/>
         </w:rPr>
-        <w:t xml:space="preserve"> </w:t>
+        <w:t xml:space="preserve"/>
       </w:r>
       <w:r>
         <w:rPr>
           <w:rFonts w:ascii="TH SarabunPSK" w:hAnsi="TH SarabunPSK" w:cs="TH SarabunPSK" w:hint="cs"/>
           <w:cs/>
         </w:rPr>
-        <w:t>(</w:t>
-      </w:r>
-      <w:r>
-        <w:rPr>
-          <w:rFonts w:ascii="TH SarabunPSK" w:hAnsi="TH SarabunPSK" w:cs="TH SarabunPSK"/>
-        </w:rPr>
-        <w:t>Level</w:t>
+        <w:t/>
+      </w:r>
+      <w:r>
+        <w:rPr>
+          <w:rFonts w:ascii="TH SarabunPSK" w:hAnsi="TH SarabunPSK" w:cs="TH SarabunPSK"/>
+        </w:rPr>
+        <w:t/>
       </w:r>
       <w:r>
         <w:rPr>
           <w:rFonts w:ascii="TH SarabunPSK" w:hAnsi="TH SarabunPSK" w:cs="TH SarabunPSK" w:hint="cs"/>
           <w:cs/>
         </w:rPr>
-        <w:t xml:space="preserve">) </w:t>
+        <w:t xml:space="preserve"/>
       </w:r>
       <w:r>
         <w:rPr>
@@ -5467,7 +5467,7 @@
           <w:szCs w:val="32"/>
           <w:cs/>
         </w:rPr>
-        <w:t>{{occupational_level}}</w:t>
+        <w:t/>
       </w:r>
       <w:r>
         <w:rPr>
@@ -6041,7 +6041,7 @@
               </w:rPr>
             </w:pPr>
             <w:r>
-              <w:t>{{uc_code}}</w:t>
+              <w:t xml:space="preserve">{{uc_code}}</w:t>
             </w:r>
           </w:p>
         </w:tc>
@@ -6060,7 +6060,7 @@
               </w:rPr>
             </w:pPr>
             <w:r>
-              <w:t>{{uc_desc}}</w:t>
+              <w:t xml:space="preserve">{{uc_desc}}</w:t>
             </w:r>
           </w:p>
         </w:tc>
@@ -6078,7 +6078,7 @@
               </w:rPr>
             </w:pPr>
             <w:r>
-              <w:t>{{eoc_code}}</w:t>
+              <w:t xml:space="preserve">{{eoc_code}}</w:t>
             </w:r>
           </w:p>
         </w:tc>
@@ -6096,7 +6096,7 @@
               </w:rPr>
             </w:pPr>
             <w:r>
-              <w:t>{{eoc_desc}}</w:t>
+              <w:t xml:space="preserve">{{eoc_desc}}</w:t>
             </w:r>
           </w:p>
         </w:tc>
@@ -6114,7 +6114,7 @@
               </w:rPr>
             </w:pPr>
             <w:r>
-              <w:t>{{criteria}}</w:t>
+              <w:t xml:space="preserve">{{criteria}}</w:t>
             </w:r>
           </w:p>
         </w:tc>
@@ -6133,7 +6133,7 @@
               </w:rPr>
             </w:pPr>
             <w:r>
-              <w:t>{{assess_method}}</w:t>
+              <w:t xml:space="preserve">{{assess_method}}</w:t>
             </w:r>
           </w:p>
         </w:tc>
@@ -7685,14 +7685,14 @@
           <w:rFonts w:ascii="TH SarabunPSK" w:hAnsi="TH SarabunPSK" w:cs="TH SarabunPSK"/>
           <w:cs/>
         </w:rPr>
-        <w:t xml:space="preserve">: </w:t>
+        <w:t xml:space="preserve">: {{occupational_standard_url}}</w:t>
       </w:r>
       <w:r>
         <w:rPr>
           <w:rFonts w:ascii="TH SarabunPSK" w:hAnsi="TH SarabunPSK" w:cs="TH SarabunPSK" w:hint="cs"/>
           <w:cs/>
         </w:rPr>
-        <w:t>{{occupational_standard_url}}</w:t>
+        <w:t/>
       </w:r>
       <w:r>
         <w:rPr>
@@ -7836,7 +7836,7 @@
                 <w:kern w:val="2"/>
                 <w:cs/>
               </w:rPr>
-              <w:t>ผลลัพธ์การเรียนรู้ระดับรายวิชา</w:t>
+              <w:t xml:space="preserve">ผลลัพธ์การเรียนรู้ระดับรายวิชา (Job) {{job_outcome}}</w:t>
             </w:r>
             <w:r>
               <w:rPr>
@@ -7846,14 +7846,14 @@
                 <w:kern w:val="2"/>
                 <w:cs/>
               </w:rPr>
-              <w:t xml:space="preserve"> </w:t>
+              <w:t xml:space="preserve"/>
             </w:r>
             <w:r>
               <w:rPr>
                 <w:rFonts w:ascii="TH SarabunPSK" w:eastAsia="Calibri" w:hAnsi="TH SarabunPSK" w:cs="TH SarabunPSK"/>
                 <w:kern w:val="2"/>
               </w:rPr>
-              <w:t>(Job)</w:t>
+              <w:t/>
             </w:r>
             <w:r>
               <w:rPr>
@@ -7862,13 +7862,13 @@
                 <w:bCs/>
                 <w:kern w:val="2"/>
               </w:rPr>
-              <w:t xml:space="preserve"> </w:t>
+              <w:t xml:space="preserve"/>
             </w:r>
             <w:r>
               <w:rPr>
                 <w:rFonts w:ascii="TH SarabunPSK" w:eastAsia="Times New Roman" w:hAnsi="TH SarabunPSK" w:cs="TH SarabunPSK"/>
               </w:rPr>
-              <w:t>{{job_outcome}}</w:t>
+              <w:t/>
             </w:r>
             <w:r>
               <w:rPr>
@@ -7901,7 +7901,7 @@
               <w:rPr>
                 <w:rFonts w:ascii="TH SarabunPSK" w:eastAsia="Times New Roman" w:hAnsi="TH SarabunPSK" w:cs="TH SarabunPSK"/>
               </w:rPr>
-              <w:t/>
+              <w:t xml:space="preserve"/>
             </w:r>
           </w:p>
           <w:p>
@@ -7917,7 +7917,7 @@
               <w:rPr>
                 <w:rFonts w:ascii="TH SarabunPSK" w:eastAsia="Times New Roman" w:hAnsi="TH SarabunPSK" w:cs="TH SarabunPSK"/>
               </w:rPr>
-              <w:t/>
+              <w:t xml:space="preserve"/>
             </w:r>
           </w:p>
         </w:tc>
@@ -8229,7 +8229,7 @@
               </w:rPr>
             </w:pPr>
             <w:r>
-              <w:t>{{task}}</w:t>
+              <w:t xml:space="preserve">{{task}}</w:t>
             </w:r>
           </w:p>
         </w:tc>
@@ -8250,7 +8250,7 @@
               </w:rPr>
             </w:pPr>
             <w:r>
-              <w:t>{{occ_element}}</w:t>
+              <w:t xml:space="preserve">{{occ_element}}</w:t>
             </w:r>
           </w:p>
         </w:tc>
@@ -8267,7 +8267,7 @@
               </w:rPr>
             </w:pPr>
             <w:r>
-              <w:t>{{op_knowledge}}</w:t>
+              <w:t xml:space="preserve">{{op_knowledge}}</w:t>
             </w:r>
           </w:p>
         </w:tc>
@@ -8285,7 +8285,7 @@
               </w:rPr>
             </w:pPr>
             <w:r>
-              <w:t>{{op_skills}}</w:t>
+              <w:t xml:space="preserve">{{op_skills}}</w:t>
             </w:r>
           </w:p>
         </w:tc>
@@ -9546,7 +9546,7 @@
           <w:bCs/>
           <w:cs/>
         </w:rPr>
-        <w:t>รหัส (</w:t>
+        <w:t xml:space="preserve">รหัส (Code){{course_code}}วิชา (Subject){{course}}หน่วยกิต (Credit) {{credits}}</w:t>
       </w:r>
       <w:r>
         <w:rPr>
@@ -9554,7 +9554,7 @@
           <w:b/>
           <w:bCs/>
         </w:rPr>
-        <w:t>Code){{course_code}}</w:t>
+        <w:t/>
       </w:r>
       <w:r>
         <w:rPr>
@@ -9588,7 +9588,7 @@
           <w:bCs/>
           <w:cs/>
         </w:rPr>
-        <w:t>วิชา</w:t>
+        <w:t/>
       </w:r>
       <w:r>
         <w:rPr>
@@ -9597,7 +9597,7 @@
           <w:bCs/>
           <w:cs/>
         </w:rPr>
-        <w:t xml:space="preserve"> </w:t>
+        <w:t xml:space="preserve"/>
       </w:r>
       <w:r>
         <w:rPr>
@@ -9606,7 +9606,7 @@
           <w:bCs/>
           <w:cs/>
         </w:rPr>
-        <w:t>(</w:t>
+        <w:t/>
       </w:r>
       <w:r>
         <w:rPr>
@@ -9614,7 +9614,7 @@
           <w:b/>
           <w:bCs/>
         </w:rPr>
-        <w:t>Subject)</w:t>
+        <w:t/>
       </w:r>
       <w:r>
         <w:rPr>
@@ -9623,7 +9623,7 @@
           <w:bCs/>
           <w:cs/>
         </w:rPr>
-        <w:t>{{course}}</w:t>
+        <w:t/>
       </w:r>
       <w:r>
         <w:rPr>
@@ -9632,7 +9632,7 @@
           <w:bCs/>
           <w:cs/>
         </w:rPr>
-        <w:t>หน่วยกิต (</w:t>
+        <w:t/>
       </w:r>
       <w:r>
         <w:rPr>
@@ -9640,7 +9640,7 @@
           <w:b/>
           <w:bCs/>
         </w:rPr>
-        <w:t>Credit</w:t>
+        <w:t/>
       </w:r>
       <w:r>
         <w:rPr>
@@ -9648,7 +9648,7 @@
           <w:b/>
           <w:bCs/>
         </w:rPr>
-        <w:t>)</w:t>
+        <w:t/>
       </w:r>
       <w:r>
         <w:rPr>
@@ -9657,7 +9657,7 @@
           <w:bCs/>
           <w:cs/>
         </w:rPr>
-        <w:t xml:space="preserve"> {{credits}}</w:t>
+        <w:t xml:space="preserve"/>
       </w:r>
     </w:p>
     <w:p>
@@ -9677,7 +9677,7 @@
           <w:bCs/>
           <w:cs/>
         </w:rPr>
-        <w:t>ชั้น (</w:t>
+        <w:t xml:space="preserve">ชั้น (Level){{education_level}} สาขาวิชา/กลุ่ม วิชา (Department){{program}} </w:t>
       </w:r>
       <w:r>
         <w:rPr>
@@ -9685,7 +9685,7 @@
           <w:b/>
           <w:bCs/>
         </w:rPr>
-        <w:t>Level){{education_level}}</w:t>
+        <w:t/>
       </w:r>
       <w:r>
         <w:rPr>
@@ -9703,7 +9703,7 @@
           <w:bCs/>
           <w:cs/>
         </w:rPr>
-        <w:t xml:space="preserve"> </w:t>
+        <w:t xml:space="preserve"/>
       </w:r>
       <w:r>
         <w:rPr>
@@ -9712,7 +9712,7 @@
           <w:bCs/>
           <w:cs/>
         </w:rPr>
-        <w:t>สาขาวิชา/กลุ่ม วิชา (</w:t>
+        <w:t/>
       </w:r>
       <w:r>
         <w:rPr>
@@ -9720,7 +9720,7 @@
           <w:b/>
           <w:bCs/>
         </w:rPr>
-        <w:t>Department){{program}}</w:t>
+        <w:t/>
       </w:r>
       <w:r>
         <w:rPr>
@@ -9739,7 +9739,7 @@
           <w:sz w:val="44"/>
           <w:szCs w:val="44"/>
         </w:rPr>
-        <w:t xml:space="preserve"> </w:t>
+        <w:t xml:space="preserve"/>
       </w:r>
     </w:p>
     <w:p>
@@ -10598,7 +10598,7 @@
               </w:rPr>
             </w:pPr>
             <w:r>
-              <w:t>{{a_unit}}</w:t>
+              <w:t xml:space="preserve">{{a_unit}}</w:t>
             </w:r>
           </w:p>
         </w:tc>
@@ -10615,7 +10615,7 @@
               </w:rPr>
             </w:pPr>
             <w:r>
-              <w:t>{{a_know}}</w:t>
+              <w:t xml:space="preserve">{{a_know}}</w:t>
             </w:r>
           </w:p>
         </w:tc>
@@ -10632,7 +10632,7 @@
               </w:rPr>
             </w:pPr>
             <w:r>
-              <w:t>{{a_comp}}</w:t>
+              <w:t xml:space="preserve">{{a_comp}}</w:t>
             </w:r>
           </w:p>
         </w:tc>
@@ -10649,7 +10649,7 @@
               </w:rPr>
             </w:pPr>
             <w:r>
-              <w:t>{{a_use}}</w:t>
+              <w:t xml:space="preserve">{{a_use}}</w:t>
             </w:r>
           </w:p>
         </w:tc>
@@ -10666,7 +10666,7 @@
               </w:rPr>
             </w:pPr>
             <w:r>
-              <w:t>{{a_analysis}}</w:t>
+              <w:t xml:space="preserve">{{a_analysis}}</w:t>
             </w:r>
           </w:p>
         </w:tc>
@@ -10683,7 +10683,7 @@
               </w:rPr>
             </w:pPr>
             <w:r>
-              <w:t>{{a_synth}}</w:t>
+              <w:t xml:space="preserve">{{a_synth}}</w:t>
             </w:r>
           </w:p>
         </w:tc>
@@ -10700,7 +10700,7 @@
               </w:rPr>
             </w:pPr>
             <w:r>
-              <w:t>{{a_eval}}</w:t>
+              <w:t xml:space="preserve">{{a_eval}}</w:t>
             </w:r>
           </w:p>
         </w:tc>
@@ -10717,7 +10717,7 @@
               </w:rPr>
             </w:pPr>
             <w:r>
-              <w:t>{{a_skill}}</w:t>
+              <w:t xml:space="preserve">{{a_skill}}</w:t>
             </w:r>
           </w:p>
         </w:tc>
@@ -10734,7 +10734,7 @@
               </w:rPr>
             </w:pPr>
             <w:r>
-              <w:t>{{a_attitude}}</w:t>
+              <w:t xml:space="preserve">{{a_attitude}}</w:t>
             </w:r>
           </w:p>
         </w:tc>
@@ -10750,7 +10750,7 @@
               </w:rPr>
             </w:pPr>
             <w:r>
-              <w:t>{{a_apply}}</w:t>
+              <w:t xml:space="preserve">{{a_apply}}</w:t>
             </w:r>
           </w:p>
         </w:tc>
@@ -10767,7 +10767,7 @@
               </w:rPr>
             </w:pPr>
             <w:r>
-              <w:t>{{a_total}}</w:t>
+              <w:t xml:space="preserve">{{a_total}}</w:t>
             </w:r>
           </w:p>
         </w:tc>
@@ -10784,7 +10784,7 @@
               </w:rPr>
             </w:pPr>
             <w:r>
-              <w:t>{{a_priority}}</w:t>
+              <w:t xml:space="preserve">{{a_priority}}</w:t>
             </w:r>
           </w:p>
         </w:tc>
@@ -10801,7 +10801,7 @@
               </w:rPr>
             </w:pPr>
             <w:r>
-              <w:t>{{a_periods}}</w:t>
+              <w:t xml:space="preserve">{{a_periods}}</w:t>
             </w:r>
           </w:p>
         </w:tc>
@@ -15091,7 +15091,7 @@
           <w:szCs w:val="36"/>
           <w:cs/>
         </w:rPr>
-        <w:t xml:space="preserve">รหัส   </w:t>
+        <w:t xml:space="preserve">รหัส   {{course_code}}    ชื่อวิชา {{course}}</w:t>
       </w:r>
       <w:r>
         <w:rPr>
@@ -15102,7 +15102,7 @@
           <w:szCs w:val="36"/>
           <w:cs/>
         </w:rPr>
-        <w:t>{{course_code}}</w:t>
+        <w:t/>
       </w:r>
       <w:r>
         <w:rPr>
@@ -15112,7 +15112,7 @@
           <w:sz w:val="36"/>
           <w:szCs w:val="36"/>
         </w:rPr>
-        <w:t xml:space="preserve">    </w:t>
+        <w:t xml:space="preserve"/>
       </w:r>
       <w:r>
         <w:rPr>
@@ -15123,7 +15123,7 @@
           <w:szCs w:val="36"/>
           <w:cs/>
         </w:rPr>
-        <w:t xml:space="preserve">ชื่อวิชา </w:t>
+        <w:t xml:space="preserve"/>
       </w:r>
       <w:r>
         <w:rPr>
@@ -15134,7 +15134,7 @@
           <w:szCs w:val="36"/>
           <w:cs/>
         </w:rPr>
-        <w:t>{{course}}</w:t>
+        <w:t/>
       </w:r>
     </w:p>
     <w:p>
@@ -15157,7 +15157,7 @@
           <w:szCs w:val="36"/>
           <w:cs/>
         </w:rPr>
-        <w:t xml:space="preserve">ทฤษฎี  </w:t>
+        <w:t xml:space="preserve">ทฤษฎี  {{theory_hours_per_week}}  ชั่วโมง/สัปดาห์ ปฏิบัติ  {{practical_hours_per_week}}   ชั่วโมง/สัปดาห์  จำนวน  {{credits}}   หน่วยกิต</w:t>
       </w:r>
       <w:r>
         <w:rPr>
@@ -15168,7 +15168,7 @@
           <w:szCs w:val="36"/>
           <w:cs/>
         </w:rPr>
-        <w:t>{{theory_hours_per_week}}</w:t>
+        <w:t/>
       </w:r>
       <w:r>
         <w:rPr>
@@ -15178,7 +15178,7 @@
           <w:sz w:val="36"/>
           <w:szCs w:val="36"/>
         </w:rPr>
-        <w:t xml:space="preserve">  </w:t>
+        <w:t xml:space="preserve"/>
       </w:r>
       <w:r>
         <w:rPr>
@@ -15189,7 +15189,7 @@
           <w:szCs w:val="36"/>
           <w:cs/>
         </w:rPr>
-        <w:t xml:space="preserve">ชั่วโมง/สัปดาห์ ปฏิบัติ  </w:t>
+        <w:t xml:space="preserve"/>
       </w:r>
       <w:r>
         <w:rPr>
@@ -15200,7 +15200,7 @@
           <w:szCs w:val="36"/>
           <w:cs/>
         </w:rPr>
-        <w:t>{{practical_hours_per_week}}</w:t>
+        <w:t/>
       </w:r>
       <w:r>
         <w:rPr>
@@ -15210,7 +15210,7 @@
           <w:sz w:val="36"/>
           <w:szCs w:val="36"/>
         </w:rPr>
-        <w:t xml:space="preserve">   </w:t>
+        <w:t xml:space="preserve"/>
       </w:r>
       <w:r>
         <w:rPr>
@@ -15221,7 +15221,7 @@
           <w:szCs w:val="36"/>
           <w:cs/>
         </w:rPr>
-        <w:t xml:space="preserve">ชั่วโมง/สัปดาห์  จำนวน  </w:t>
+        <w:t xml:space="preserve"/>
       </w:r>
       <w:r>
         <w:rPr>
@@ -15232,7 +15232,7 @@
           <w:szCs w:val="36"/>
           <w:cs/>
         </w:rPr>
-        <w:t>{{credits}}</w:t>
+        <w:t/>
       </w:r>
       <w:r>
         <w:rPr>
@@ -15242,7 +15242,7 @@
           <w:sz w:val="36"/>
           <w:szCs w:val="36"/>
         </w:rPr>
-        <w:t xml:space="preserve">   </w:t>
+        <w:t xml:space="preserve"/>
       </w:r>
       <w:r>
         <w:rPr>
@@ -15253,7 +15253,7 @@
           <w:szCs w:val="36"/>
           <w:cs/>
         </w:rPr>
-        <w:t>หน่วยกิต</w:t>
+        <w:t/>
       </w:r>
     </w:p>
     <w:p>
@@ -15575,7 +15575,7 @@
               </w:rPr>
             </w:pPr>
             <w:r>
-              <w:t>{{s_no}}</w:t>
+              <w:t xml:space="preserve">{{s_no}}</w:t>
             </w:r>
           </w:p>
         </w:tc>
@@ -15596,7 +15596,7 @@
               </w:rPr>
             </w:pPr>
             <w:r>
-              <w:t>{{s_unit}}</w:t>
+              <w:t xml:space="preserve">{{s_unit}}</w:t>
             </w:r>
           </w:p>
         </w:tc>
@@ -15616,7 +15616,7 @@
               </w:rPr>
             </w:pPr>
             <w:r>
-              <w:t>{{s_theory}}</w:t>
+              <w:t xml:space="preserve">{{s_theory}}</w:t>
             </w:r>
           </w:p>
         </w:tc>
@@ -15636,7 +15636,7 @@
               </w:rPr>
             </w:pPr>
             <w:r>
-              <w:t>{{s_practice}}</w:t>
+              <w:t xml:space="preserve">{{s_practice}}</w:t>
             </w:r>
           </w:p>
         </w:tc>
@@ -15656,7 +15656,7 @@
               </w:rPr>
             </w:pPr>
             <w:r>
-              <w:t>{{s_total}}</w:t>
+              <w:t xml:space="preserve">{{s_total}}</w:t>
             </w:r>
           </w:p>
         </w:tc>
@@ -16954,7 +16954,7 @@
                 <w:rFonts w:ascii="TH SarabunPSK" w:hAnsi="TH SarabunPSK" w:cs="TH SarabunPSK"/>
                 <w:cs/>
               </w:rPr>
-              <w:t xml:space="preserve">หน่วยที่ </w:t>
+              <w:t xml:space="preserve">หน่วยที่ (No. of Unit) {{unit_no}}</w:t>
             </w:r>
             <w:r>
               <w:rPr>
@@ -16962,14 +16962,14 @@
                 <w:b w:val="0"/>
                 <w:bCs w:val="0"/>
               </w:rPr>
-              <w:t>(No. of Unit)</w:t>
+              <w:t/>
             </w:r>
             <w:r>
               <w:rPr>
                 <w:rFonts w:ascii="TH SarabunPSK" w:hAnsi="TH SarabunPSK" w:cs="TH SarabunPSK" w:hint="cs"/>
                 <w:cs/>
               </w:rPr>
-              <w:t xml:space="preserve"> {{unit_no}}</w:t>
+              <w:t xml:space="preserve"/>
             </w:r>
           </w:p>
         </w:tc>
@@ -16998,40 +16998,40 @@
                 <w:rFonts w:ascii="TH SarabunPSK" w:hAnsi="TH SarabunPSK" w:cs="TH SarabunPSK"/>
                 <w:cs/>
               </w:rPr>
-              <w:t>จำนวน</w:t>
-            </w:r>
-            <w:r>
-              <w:rPr>
-                <w:rFonts w:ascii="TH SarabunPSK" w:hAnsi="TH SarabunPSK" w:cs="TH SarabunPSK"/>
-                <w:cs/>
-              </w:rPr>
-              <w:t xml:space="preserve"> </w:t>
-            </w:r>
-            <w:r>
-              <w:rPr>
-                <w:rFonts w:ascii="TH SarabunPSK" w:hAnsi="TH SarabunPSK" w:cs="TH SarabunPSK"/>
-              </w:rPr>
-              <w:t>(No. of hours)</w:t>
-            </w:r>
-            <w:r>
-              <w:rPr>
-                <w:rFonts w:ascii="TH SarabunPSK" w:hAnsi="TH SarabunPSK" w:cs="TH SarabunPSK"/>
-              </w:rPr>
-              <w:t xml:space="preserve"> {{unit_hours}} </w:t>
-            </w:r>
-            <w:r>
-              <w:rPr>
-                <w:rFonts w:ascii="TH SarabunPSK" w:hAnsi="TH SarabunPSK" w:cs="TH SarabunPSK"/>
-                <w:cs/>
-              </w:rPr>
-              <w:t>ชั่</w:t>
-            </w:r>
-            <w:r>
-              <w:rPr>
-                <w:rFonts w:ascii="TH SarabunPSK" w:hAnsi="TH SarabunPSK" w:cs="TH SarabunPSK"/>
-                <w:cs/>
-              </w:rPr>
-              <w:t>วโมง</w:t>
+              <w:t xml:space="preserve">จำนวน (No. of hours) {{unit_hours}} ชั่วโมง</w:t>
+            </w:r>
+            <w:r>
+              <w:rPr>
+                <w:rFonts w:ascii="TH SarabunPSK" w:hAnsi="TH SarabunPSK" w:cs="TH SarabunPSK"/>
+                <w:cs/>
+              </w:rPr>
+              <w:t xml:space="preserve"/>
+            </w:r>
+            <w:r>
+              <w:rPr>
+                <w:rFonts w:ascii="TH SarabunPSK" w:hAnsi="TH SarabunPSK" w:cs="TH SarabunPSK"/>
+              </w:rPr>
+              <w:t/>
+            </w:r>
+            <w:r>
+              <w:rPr>
+                <w:rFonts w:ascii="TH SarabunPSK" w:hAnsi="TH SarabunPSK" w:cs="TH SarabunPSK"/>
+              </w:rPr>
+              <w:t xml:space="preserve"/>
+            </w:r>
+            <w:r>
+              <w:rPr>
+                <w:rFonts w:ascii="TH SarabunPSK" w:hAnsi="TH SarabunPSK" w:cs="TH SarabunPSK"/>
+                <w:cs/>
+              </w:rPr>
+              <w:t/>
+            </w:r>
+            <w:r>
+              <w:rPr>
+                <w:rFonts w:ascii="TH SarabunPSK" w:hAnsi="TH SarabunPSK" w:cs="TH SarabunPSK"/>
+                <w:cs/>
+              </w:rPr>
+              <w:t/>
             </w:r>
           </w:p>
         </w:tc>
@@ -17080,46 +17080,46 @@
                 <w:bCs/>
                 <w:cs/>
               </w:rPr>
-              <w:t>ชื่อ</w:t>
-            </w:r>
-            <w:r>
-              <w:rPr>
-                <w:rFonts w:ascii="TH SarabunPSK" w:hAnsi="TH SarabunPSK" w:cs="TH SarabunPSK"/>
-                <w:b/>
-                <w:bCs/>
-                <w:cs/>
-              </w:rPr>
-              <w:t>เรื่อง</w:t>
-            </w:r>
-            <w:r>
-              <w:rPr>
-                <w:rFonts w:ascii="TH SarabunPSK" w:hAnsi="TH SarabunPSK" w:cs="TH SarabunPSK"/>
-                <w:cs/>
-              </w:rPr>
-              <w:t xml:space="preserve"> </w:t>
-            </w:r>
-            <w:r>
-              <w:rPr>
-                <w:rFonts w:ascii="TH SarabunPSK" w:hAnsi="TH SarabunPSK" w:cs="TH SarabunPSK"/>
-              </w:rPr>
-              <w:t>(Name of Unit)</w:t>
-            </w:r>
-            <w:r>
-              <w:rPr>
-                <w:rFonts w:ascii="TH SarabunPSK" w:hAnsi="TH SarabunPSK" w:cs="TH SarabunPSK"/>
-                <w:b/>
-                <w:bCs/>
-                <w:cs/>
-              </w:rPr>
-              <w:t xml:space="preserve">  </w:t>
-            </w:r>
-            <w:r>
-              <w:rPr>
-                <w:rFonts w:ascii="TH SarabunPSK" w:hAnsi="TH SarabunPSK" w:cs="TH SarabunPSK"/>
-                <w:b/>
-                <w:bCs/>
-              </w:rPr>
-              <w:t>{{unit_title}}</w:t>
+              <w:t xml:space="preserve">ชื่อเรื่อง (Name of Unit)  {{unit_title}}</w:t>
+            </w:r>
+            <w:r>
+              <w:rPr>
+                <w:rFonts w:ascii="TH SarabunPSK" w:hAnsi="TH SarabunPSK" w:cs="TH SarabunPSK"/>
+                <w:b/>
+                <w:bCs/>
+                <w:cs/>
+              </w:rPr>
+              <w:t/>
+            </w:r>
+            <w:r>
+              <w:rPr>
+                <w:rFonts w:ascii="TH SarabunPSK" w:hAnsi="TH SarabunPSK" w:cs="TH SarabunPSK"/>
+                <w:cs/>
+              </w:rPr>
+              <w:t xml:space="preserve"/>
+            </w:r>
+            <w:r>
+              <w:rPr>
+                <w:rFonts w:ascii="TH SarabunPSK" w:hAnsi="TH SarabunPSK" w:cs="TH SarabunPSK"/>
+              </w:rPr>
+              <w:t/>
+            </w:r>
+            <w:r>
+              <w:rPr>
+                <w:rFonts w:ascii="TH SarabunPSK" w:hAnsi="TH SarabunPSK" w:cs="TH SarabunPSK"/>
+                <w:b/>
+                <w:bCs/>
+                <w:cs/>
+              </w:rPr>
+              <w:t xml:space="preserve"/>
+            </w:r>
+            <w:r>
+              <w:rPr>
+                <w:rFonts w:ascii="TH SarabunPSK" w:hAnsi="TH SarabunPSK" w:cs="TH SarabunPSK"/>
+                <w:b/>
+                <w:bCs/>
+              </w:rPr>
+              <w:t/>
             </w:r>
           </w:p>
         </w:tc>
@@ -17204,7 +17204,7 @@
               <w:rPr>
                 <w:rFonts w:ascii="TH SarabunPSK" w:hAnsi="TH SarabunPSK" w:cs="TH SarabunPSK"/>
               </w:rPr>
-              <w:t>{{unit_learning_outcomes}}</w:t>
+              <w:t xml:space="preserve">{{unit_learning_outcomes}}</w:t>
             </w:r>
           </w:p>
           <w:p>
@@ -17291,21 +17291,21 @@
                 <w:rFonts w:ascii="TH SarabunPSK" w:hAnsi="TH SarabunPSK" w:cs="TH SarabunPSK"/>
                 <w:cs/>
               </w:rPr>
-              <w:t xml:space="preserve"> มาตรฐานอาชีพ{{unit_reference_standards}}</w:t>
+              <w:t xml:space="preserve"> มาตรฐานอาชีพ{{unit_reference_standards}} สมรรถนะย่อย{{unit_element}}</w:t>
             </w:r>
             <w:r>
               <w:rPr>
                 <w:rFonts w:ascii="TH SarabunPSK" w:hAnsi="TH SarabunPSK" w:cs="TH SarabunPSK" w:hint="cs"/>
                 <w:cs/>
               </w:rPr>
-              <w:t xml:space="preserve"> </w:t>
-            </w:r>
-            <w:r>
-              <w:rPr>
-                <w:rFonts w:ascii="TH SarabunPSK" w:hAnsi="TH SarabunPSK" w:cs="TH SarabunPSK"/>
-                <w:cs/>
-              </w:rPr>
-              <w:t>สมรรถนะย่อย{{unit_element}}</w:t>
+              <w:t xml:space="preserve"/>
+            </w:r>
+            <w:r>
+              <w:rPr>
+                <w:rFonts w:ascii="TH SarabunPSK" w:hAnsi="TH SarabunPSK" w:cs="TH SarabunPSK"/>
+                <w:cs/>
+              </w:rPr>
+              <w:t/>
             </w:r>
             <w:r>
               <w:rPr>
@@ -17593,7 +17593,7 @@
               <w:rPr>
                 <w:rFonts w:ascii="TH SarabunPSK" w:hAnsi="TH SarabunPSK" w:cs="TH SarabunPSK"/>
               </w:rPr>
-              <w:t>{{unit_competency}}</w:t>
+              <w:t xml:space="preserve">{{unit_competency}}</w:t>
             </w:r>
           </w:p>
           <w:p>
@@ -17692,7 +17692,7 @@
                 <w:rFonts w:ascii="TH SarabunPSK" w:eastAsia="Angsana New" w:hAnsi="TH SarabunPSK" w:cs="TH SarabunPSK"/>
                 <w:cs/>
               </w:rPr>
-              <w:t>{{unit_objectives}}</w:t>
+              <w:t xml:space="preserve">{{unit_objectives}}</w:t>
             </w:r>
             <w:r>
               <w:rPr>
@@ -17791,7 +17791,7 @@
                 <w:rFonts w:ascii="TH SarabunPSK" w:hAnsi="TH SarabunPSK" w:cs="TH SarabunPSK"/>
                 <w:cs/>
               </w:rPr>
-              <w:t>{{unit_content}}</w:t>
+              <w:t xml:space="preserve">{{unit_content}}</w:t>
             </w:r>
           </w:p>
           <w:p>
@@ -17868,7 +17868,7 @@
                 <w:cs/>
               </w:rPr>
               <w:lastRenderedPageBreak/>
-              <w:t xml:space="preserve">หน่วยที่ </w:t>
+              <w:t xml:space="preserve">หน่วยที่ (No. of Unit) {{unit_no}}</w:t>
             </w:r>
             <w:r>
               <w:rPr>
@@ -17876,14 +17876,14 @@
                 <w:b w:val="0"/>
                 <w:bCs w:val="0"/>
               </w:rPr>
-              <w:t>(No. of Unit)</w:t>
+              <w:t/>
             </w:r>
             <w:r>
               <w:rPr>
                 <w:rFonts w:ascii="TH SarabunPSK" w:hAnsi="TH SarabunPSK" w:cs="TH SarabunPSK" w:hint="cs"/>
                 <w:cs/>
               </w:rPr>
-              <w:t xml:space="preserve"> {{unit_no}}</w:t>
+              <w:t xml:space="preserve"/>
             </w:r>
           </w:p>
         </w:tc>
@@ -17912,27 +17912,27 @@
                 <w:rFonts w:ascii="TH SarabunPSK" w:hAnsi="TH SarabunPSK" w:cs="TH SarabunPSK"/>
                 <w:cs/>
               </w:rPr>
-              <w:t xml:space="preserve">จำนวน </w:t>
-            </w:r>
-            <w:r>
-              <w:rPr>
-                <w:rFonts w:ascii="TH SarabunPSK" w:hAnsi="TH SarabunPSK" w:cs="TH SarabunPSK"/>
-              </w:rPr>
-              <w:t>(No. of hours)</w:t>
+              <w:t xml:space="preserve">จำนวน (No. of hours) {{unit_hours}} ชั่วโมง</w:t>
+            </w:r>
+            <w:r>
+              <w:rPr>
+                <w:rFonts w:ascii="TH SarabunPSK" w:hAnsi="TH SarabunPSK" w:cs="TH SarabunPSK"/>
+              </w:rPr>
+              <w:t/>
             </w:r>
             <w:r>
               <w:rPr>
                 <w:rFonts w:ascii="TH SarabunPSK" w:hAnsi="TH SarabunPSK" w:cs="TH SarabunPSK" w:hint="cs"/>
                 <w:cs/>
               </w:rPr>
-              <w:t xml:space="preserve"> {{unit_hours}} </w:t>
-            </w:r>
-            <w:r>
-              <w:rPr>
-                <w:rFonts w:ascii="TH SarabunPSK" w:hAnsi="TH SarabunPSK" w:cs="TH SarabunPSK"/>
-                <w:cs/>
-              </w:rPr>
-              <w:t>ชั่วโมง</w:t>
+              <w:t xml:space="preserve"/>
+            </w:r>
+            <w:r>
+              <w:rPr>
+                <w:rFonts w:ascii="TH SarabunPSK" w:hAnsi="TH SarabunPSK" w:cs="TH SarabunPSK"/>
+                <w:cs/>
+              </w:rPr>
+              <w:t/>
             </w:r>
           </w:p>
         </w:tc>
@@ -17977,29 +17977,29 @@
                 <w:bCs/>
                 <w:cs/>
               </w:rPr>
-              <w:t>ชื่อเรื่อง</w:t>
-            </w:r>
-            <w:r>
-              <w:rPr>
-                <w:rFonts w:ascii="TH SarabunPSK" w:hAnsi="TH SarabunPSK" w:cs="TH SarabunPSK"/>
-                <w:cs/>
-              </w:rPr>
-              <w:t xml:space="preserve"> </w:t>
-            </w:r>
-            <w:r>
-              <w:rPr>
-                <w:rFonts w:ascii="TH SarabunPSK" w:hAnsi="TH SarabunPSK" w:cs="TH SarabunPSK"/>
-              </w:rPr>
-              <w:t>(Name of Unit)</w:t>
-            </w:r>
-            <w:r>
-              <w:rPr>
-                <w:rFonts w:ascii="TH SarabunPSK" w:hAnsi="TH SarabunPSK" w:cs="TH SarabunPSK"/>
-                <w:b/>
-                <w:bCs/>
-                <w:cs/>
-              </w:rPr>
-              <w:t xml:space="preserve">  </w:t>
+              <w:t xml:space="preserve">ชื่อเรื่อง (Name of Unit)  {{unit_title}}</w:t>
+            </w:r>
+            <w:r>
+              <w:rPr>
+                <w:rFonts w:ascii="TH SarabunPSK" w:hAnsi="TH SarabunPSK" w:cs="TH SarabunPSK"/>
+                <w:cs/>
+              </w:rPr>
+              <w:t xml:space="preserve"/>
+            </w:r>
+            <w:r>
+              <w:rPr>
+                <w:rFonts w:ascii="TH SarabunPSK" w:hAnsi="TH SarabunPSK" w:cs="TH SarabunPSK"/>
+              </w:rPr>
+              <w:t/>
+            </w:r>
+            <w:r>
+              <w:rPr>
+                <w:rFonts w:ascii="TH SarabunPSK" w:hAnsi="TH SarabunPSK" w:cs="TH SarabunPSK"/>
+                <w:b/>
+                <w:bCs/>
+                <w:cs/>
+              </w:rPr>
+              <w:t xml:space="preserve"/>
             </w:r>
             <w:r>
               <w:rPr>
@@ -18008,7 +18008,7 @@
                 <w:bCs/>
                 <w:cs/>
               </w:rPr>
-              <w:t>{{unit_title}}</w:t>
+              <w:t/>
             </w:r>
           </w:p>
         </w:tc>
@@ -18117,20 +18117,20 @@
                 <w:rFonts w:ascii="TH SarabunPSK" w:hAnsi="TH SarabunPSK" w:cs="TH SarabunPSK"/>
                 <w:cs/>
               </w:rPr>
-              <w:t>{{learning_activities}}</w:t>
-            </w:r>
-          </w:p>
-          <w:p>
-            <w:pPr>
-              <w:rPr>
-                <w:rFonts w:ascii="TH SarabunPSK" w:hAnsi="TH SarabunPSK" w:cs="TH SarabunPSK"/>
-              </w:rPr>
-            </w:pPr>
-            <w:r>
-              <w:rPr>
-                <w:rFonts w:ascii="TH SarabunPSK" w:hAnsi="TH SarabunPSK" w:cs="TH SarabunPSK"/>
-              </w:rPr>
-              <w:t/>
+              <w:t xml:space="preserve">{{learning_activities}}</w:t>
+            </w:r>
+          </w:p>
+          <w:p>
+            <w:pPr>
+              <w:rPr>
+                <w:rFonts w:ascii="TH SarabunPSK" w:hAnsi="TH SarabunPSK" w:cs="TH SarabunPSK"/>
+              </w:rPr>
+            </w:pPr>
+            <w:r>
+              <w:rPr>
+                <w:rFonts w:ascii="TH SarabunPSK" w:hAnsi="TH SarabunPSK" w:cs="TH SarabunPSK"/>
+              </w:rPr>
+              <w:t xml:space="preserve"/>
             </w:r>
           </w:p>
           <w:p>
@@ -18430,7 +18430,7 @@
                 <w:cs/>
               </w:rPr>
               <w:lastRenderedPageBreak/>
-              <w:t xml:space="preserve">หน่วยที่ </w:t>
+              <w:t xml:space="preserve">หน่วยที่ (No. of Unit) {{unit_no}}</w:t>
             </w:r>
             <w:r>
               <w:rPr>
@@ -18438,14 +18438,14 @@
                 <w:b w:val="0"/>
                 <w:bCs w:val="0"/>
               </w:rPr>
-              <w:t>(No. of Unit)</w:t>
+              <w:t/>
             </w:r>
             <w:r>
               <w:rPr>
                 <w:rFonts w:ascii="TH SarabunPSK" w:hAnsi="TH SarabunPSK" w:cs="TH SarabunPSK" w:hint="cs"/>
                 <w:cs/>
               </w:rPr>
-              <w:t xml:space="preserve"> {{unit_no}}</w:t>
+              <w:t xml:space="preserve"/>
             </w:r>
           </w:p>
         </w:tc>
@@ -18474,7 +18474,7 @@
                 <w:rFonts w:ascii="TH SarabunPSK" w:hAnsi="TH SarabunPSK" w:cs="TH SarabunPSK"/>
                 <w:cs/>
               </w:rPr>
-              <w:t xml:space="preserve">จำนวน </w:t>
+              <w:t xml:space="preserve">จำนวน (No. of hours) {{unit_hours}} ชั่วโมง</w:t>
             </w:r>
             <w:r>
               <w:rPr>
@@ -18482,7 +18482,7 @@
                 <w:b w:val="0"/>
                 <w:bCs w:val="0"/>
               </w:rPr>
-              <w:t>(No. of hours</w:t>
+              <w:t/>
             </w:r>
             <w:r>
               <w:rPr>
@@ -18490,20 +18490,20 @@
                 <w:b w:val="0"/>
                 <w:bCs w:val="0"/>
               </w:rPr>
-              <w:t>)</w:t>
-            </w:r>
-            <w:r>
-              <w:rPr>
-                <w:rFonts w:ascii="TH SarabunPSK" w:hAnsi="TH SarabunPSK" w:cs="TH SarabunPSK"/>
-              </w:rPr>
-              <w:t xml:space="preserve"> {{unit_hours}} </w:t>
-            </w:r>
-            <w:r>
-              <w:rPr>
-                <w:rFonts w:ascii="TH SarabunPSK" w:hAnsi="TH SarabunPSK" w:cs="TH SarabunPSK"/>
-                <w:cs/>
-              </w:rPr>
-              <w:t>ชั่วโมง</w:t>
+              <w:t/>
+            </w:r>
+            <w:r>
+              <w:rPr>
+                <w:rFonts w:ascii="TH SarabunPSK" w:hAnsi="TH SarabunPSK" w:cs="TH SarabunPSK"/>
+              </w:rPr>
+              <w:t xml:space="preserve"/>
+            </w:r>
+            <w:r>
+              <w:rPr>
+                <w:rFonts w:ascii="TH SarabunPSK" w:hAnsi="TH SarabunPSK" w:cs="TH SarabunPSK"/>
+                <w:cs/>
+              </w:rPr>
+              <w:t/>
             </w:r>
           </w:p>
         </w:tc>
@@ -18548,29 +18548,29 @@
                 <w:bCs/>
                 <w:cs/>
               </w:rPr>
-              <w:t>ชื่อเรื่อง</w:t>
-            </w:r>
-            <w:r>
-              <w:rPr>
-                <w:rFonts w:ascii="TH SarabunPSK" w:hAnsi="TH SarabunPSK" w:cs="TH SarabunPSK"/>
-                <w:cs/>
-              </w:rPr>
-              <w:t xml:space="preserve"> </w:t>
-            </w:r>
-            <w:r>
-              <w:rPr>
-                <w:rFonts w:ascii="TH SarabunPSK" w:hAnsi="TH SarabunPSK" w:cs="TH SarabunPSK"/>
-              </w:rPr>
-              <w:t>(Name of Unit)</w:t>
-            </w:r>
-            <w:r>
-              <w:rPr>
-                <w:rFonts w:ascii="TH SarabunPSK" w:hAnsi="TH SarabunPSK" w:cs="TH SarabunPSK"/>
-                <w:b/>
-                <w:bCs/>
-                <w:cs/>
-              </w:rPr>
-              <w:t xml:space="preserve">  </w:t>
+              <w:t xml:space="preserve">ชื่อเรื่อง (Name of Unit)  {{unit_title}}</w:t>
+            </w:r>
+            <w:r>
+              <w:rPr>
+                <w:rFonts w:ascii="TH SarabunPSK" w:hAnsi="TH SarabunPSK" w:cs="TH SarabunPSK"/>
+                <w:cs/>
+              </w:rPr>
+              <w:t xml:space="preserve"/>
+            </w:r>
+            <w:r>
+              <w:rPr>
+                <w:rFonts w:ascii="TH SarabunPSK" w:hAnsi="TH SarabunPSK" w:cs="TH SarabunPSK"/>
+              </w:rPr>
+              <w:t/>
+            </w:r>
+            <w:r>
+              <w:rPr>
+                <w:rFonts w:ascii="TH SarabunPSK" w:hAnsi="TH SarabunPSK" w:cs="TH SarabunPSK"/>
+                <w:b/>
+                <w:bCs/>
+                <w:cs/>
+              </w:rPr>
+              <w:t xml:space="preserve"/>
             </w:r>
             <w:r>
               <w:rPr>
@@ -18579,7 +18579,7 @@
                 <w:bCs/>
                 <w:cs/>
               </w:rPr>
-              <w:t>{{unit_title}}</w:t>
+              <w:t/>
             </w:r>
           </w:p>
         </w:tc>
@@ -18638,11 +18638,9 @@
                 <w:szCs w:val="12"/>
               </w:rPr>
             </w:pPr>
-            <w:p>
-              <w:r>
-                <w:t>{{learning_resources}}</w:t>
-              </w:r>
-            </w:p>
+            <w:r>
+              <w:t xml:space="preserve">{{learning_resources}}</w:t>
+            </w:r>
           </w:p>
           <w:tbl>
             <w:tblPr>
@@ -19324,7 +19322,7 @@
               <w:rPr>
                 <w:rFonts w:ascii="TH SarabunPSK" w:hAnsi="TH SarabunPSK" w:cs="TH SarabunPSK"/>
               </w:rPr>
-              <w:t>{{knowledge_evidence}}</w:t>
+              <w:t xml:space="preserve">{{knowledge_evidence}}หลักฐานการปฏิบัติงาน (Practical Work Evidence) {{practical_evidence}}</w:t>
             </w:r>
             <w:r>
               <w:rPr>
@@ -19337,27 +19335,27 @@
                 <w:rFonts w:ascii="TH SarabunPSK" w:hAnsi="TH SarabunPSK" w:cs="TH SarabunPSK"/>
                 <w:cs/>
               </w:rPr>
-              <w:t>หลักฐานการปฏิบัติงาน</w:t>
+              <w:t/>
             </w:r>
             <w:r>
               <w:rPr>
                 <w:rFonts w:ascii="TH SarabunPSK" w:hAnsi="TH SarabunPSK" w:cs="TH SarabunPSK" w:hint="cs"/>
                 <w:cs/>
               </w:rPr>
-              <w:t xml:space="preserve"> (</w:t>
-            </w:r>
-            <w:r>
-              <w:rPr>
-                <w:rFonts w:ascii="TH SarabunPSK" w:hAnsi="TH SarabunPSK" w:cs="TH SarabunPSK"/>
-              </w:rPr>
-              <w:t>Practical Work Evidence</w:t>
+              <w:t xml:space="preserve"/>
+            </w:r>
+            <w:r>
+              <w:rPr>
+                <w:rFonts w:ascii="TH SarabunPSK" w:hAnsi="TH SarabunPSK" w:cs="TH SarabunPSK"/>
+              </w:rPr>
+              <w:t/>
             </w:r>
             <w:r>
               <w:rPr>
                 <w:rFonts w:ascii="TH SarabunPSK" w:hAnsi="TH SarabunPSK" w:cs="TH SarabunPSK" w:hint="cs"/>
                 <w:cs/>
               </w:rPr>
-              <w:t xml:space="preserve">) </w:t>
+              <w:t xml:space="preserve"/>
             </w:r>
             <w:r>
               <w:rPr>
@@ -19365,7 +19363,7 @@
                 <w:cs/>
               </w:rPr>
               <w:tab/>
-              <w:t>{{practical_evidence}}</w:t>
+              <w:t/>
             </w:r>
             <w:r>
               <w:rPr>
@@ -19456,7 +19454,7 @@
                 <w:cs/>
               </w:rPr>
               <w:lastRenderedPageBreak/>
-              <w:t xml:space="preserve">หน่วยที่ </w:t>
+              <w:t xml:space="preserve">หน่วยที่ (No. of Unit) {{unit_no}}</w:t>
             </w:r>
             <w:r>
               <w:rPr>
@@ -19464,7 +19462,7 @@
                 <w:b w:val="0"/>
                 <w:bCs w:val="0"/>
               </w:rPr>
-              <w:t>(No. of Unit)</w:t>
+              <w:t/>
             </w:r>
             <w:r>
               <w:rPr>
@@ -19472,7 +19470,7 @@
                 <w:b w:val="0"/>
                 <w:bCs w:val="0"/>
               </w:rPr>
-              <w:t xml:space="preserve"> {{unit_no}}</w:t>
+              <w:t xml:space="preserve"/>
             </w:r>
             <w:r>
               <w:rPr>
@@ -19507,27 +19505,27 @@
                 <w:rFonts w:ascii="TH SarabunPSK" w:hAnsi="TH SarabunPSK" w:cs="TH SarabunPSK"/>
                 <w:cs/>
               </w:rPr>
-              <w:t xml:space="preserve">จำนวน </w:t>
-            </w:r>
-            <w:r>
-              <w:rPr>
-                <w:rFonts w:ascii="TH SarabunPSK" w:hAnsi="TH SarabunPSK" w:cs="TH SarabunPSK"/>
-              </w:rPr>
-              <w:t>(No. of hours)</w:t>
+              <w:t xml:space="preserve">จำนวน (No. of hours) {{unit_hours}} ชั่วโมง</w:t>
+            </w:r>
+            <w:r>
+              <w:rPr>
+                <w:rFonts w:ascii="TH SarabunPSK" w:hAnsi="TH SarabunPSK" w:cs="TH SarabunPSK"/>
+              </w:rPr>
+              <w:t/>
             </w:r>
             <w:r>
               <w:rPr>
                 <w:rFonts w:ascii="TH SarabunPSK" w:hAnsi="TH SarabunPSK" w:cs="TH SarabunPSK" w:hint="cs"/>
                 <w:cs/>
               </w:rPr>
-              <w:t xml:space="preserve"> {{unit_hours}}</w:t>
-            </w:r>
-            <w:r>
-              <w:rPr>
-                <w:rFonts w:ascii="TH SarabunPSK" w:hAnsi="TH SarabunPSK" w:cs="TH SarabunPSK"/>
-                <w:cs/>
-              </w:rPr>
-              <w:t xml:space="preserve"> ชั่วโมง</w:t>
+              <w:t xml:space="preserve"/>
+            </w:r>
+            <w:r>
+              <w:rPr>
+                <w:rFonts w:ascii="TH SarabunPSK" w:hAnsi="TH SarabunPSK" w:cs="TH SarabunPSK"/>
+                <w:cs/>
+              </w:rPr>
+              <w:t xml:space="preserve"/>
             </w:r>
           </w:p>
         </w:tc>
@@ -19572,37 +19570,37 @@
                 <w:bCs/>
                 <w:cs/>
               </w:rPr>
-              <w:t>ชื่อเรื่อง</w:t>
-            </w:r>
-            <w:r>
-              <w:rPr>
-                <w:rFonts w:ascii="TH SarabunPSK" w:hAnsi="TH SarabunPSK" w:cs="TH SarabunPSK"/>
-                <w:cs/>
-              </w:rPr>
-              <w:t xml:space="preserve"> </w:t>
-            </w:r>
-            <w:r>
-              <w:rPr>
-                <w:rFonts w:ascii="TH SarabunPSK" w:hAnsi="TH SarabunPSK" w:cs="TH SarabunPSK"/>
-              </w:rPr>
-              <w:t>(Name of Unit)</w:t>
-            </w:r>
-            <w:r>
-              <w:rPr>
-                <w:rFonts w:ascii="TH SarabunPSK" w:hAnsi="TH SarabunPSK" w:cs="TH SarabunPSK"/>
-                <w:b/>
-                <w:bCs/>
-                <w:cs/>
-              </w:rPr>
-              <w:t xml:space="preserve">  </w:t>
-            </w:r>
-            <w:r>
-              <w:rPr>
-                <w:rFonts w:ascii="TH SarabunPSK" w:hAnsi="TH SarabunPSK" w:cs="TH SarabunPSK"/>
-                <w:b/>
-                <w:bCs/>
-              </w:rPr>
-              <w:t>{{unit_title}}</w:t>
+              <w:t xml:space="preserve">ชื่อเรื่อง (Name of Unit)  {{unit_title}}</w:t>
+            </w:r>
+            <w:r>
+              <w:rPr>
+                <w:rFonts w:ascii="TH SarabunPSK" w:hAnsi="TH SarabunPSK" w:cs="TH SarabunPSK"/>
+                <w:cs/>
+              </w:rPr>
+              <w:t xml:space="preserve"/>
+            </w:r>
+            <w:r>
+              <w:rPr>
+                <w:rFonts w:ascii="TH SarabunPSK" w:hAnsi="TH SarabunPSK" w:cs="TH SarabunPSK"/>
+              </w:rPr>
+              <w:t/>
+            </w:r>
+            <w:r>
+              <w:rPr>
+                <w:rFonts w:ascii="TH SarabunPSK" w:hAnsi="TH SarabunPSK" w:cs="TH SarabunPSK"/>
+                <w:b/>
+                <w:bCs/>
+                <w:cs/>
+              </w:rPr>
+              <w:t xml:space="preserve"/>
+            </w:r>
+            <w:r>
+              <w:rPr>
+                <w:rFonts w:ascii="TH SarabunPSK" w:hAnsi="TH SarabunPSK" w:cs="TH SarabunPSK"/>
+                <w:b/>
+                <w:bCs/>
+              </w:rPr>
+              <w:t/>
             </w:r>
           </w:p>
         </w:tc>
@@ -19715,22 +19713,22 @@
                 <w:rFonts w:ascii="TH SarabunPSK" w:hAnsi="TH SarabunPSK" w:cs="TH SarabunPSK"/>
                 <w:cs/>
               </w:rPr>
-              <w:t>{{assessment_tools}}</w:t>
-            </w:r>
-          </w:p>
-          <w:p>
-            <w:pPr>
-              <w:rPr>
-                <w:rFonts w:ascii="TH SarabunPSK" w:hAnsi="TH SarabunPSK" w:cs="TH SarabunPSK"/>
-                <w:cs/>
-              </w:rPr>
-            </w:pPr>
-            <w:r>
-              <w:rPr>
-                <w:rFonts w:ascii="TH SarabunPSK" w:hAnsi="TH SarabunPSK" w:cs="TH SarabunPSK"/>
-                <w:cs/>
-              </w:rPr>
-              <w:t/>
+              <w:t xml:space="preserve">{{assessment_tools}}</w:t>
+            </w:r>
+          </w:p>
+          <w:p>
+            <w:pPr>
+              <w:rPr>
+                <w:rFonts w:ascii="TH SarabunPSK" w:hAnsi="TH SarabunPSK" w:cs="TH SarabunPSK"/>
+                <w:cs/>
+              </w:rPr>
+            </w:pPr>
+            <w:r>
+              <w:rPr>
+                <w:rFonts w:ascii="TH SarabunPSK" w:hAnsi="TH SarabunPSK" w:cs="TH SarabunPSK"/>
+                <w:cs/>
+              </w:rPr>
+              <w:t xml:space="preserve"/>
             </w:r>
           </w:p>
           <w:p>
@@ -19806,21 +19804,21 @@
                 <w:rFonts w:ascii="TH SarabunPSK" w:hAnsi="TH SarabunPSK" w:cs="TH SarabunPSK"/>
                 <w:cs/>
               </w:rPr>
-              <w:t>{{assessment_criteria}}</w:t>
-            </w:r>
-          </w:p>
-          <w:p>
-            <w:pPr>
-              <w:rPr>
-                <w:rFonts w:ascii="TH SarabunPSK" w:hAnsi="TH SarabunPSK" w:cs="TH SarabunPSK"/>
-              </w:rPr>
-            </w:pPr>
-            <w:r>
-              <w:rPr>
-                <w:rFonts w:ascii="TH SarabunPSK" w:hAnsi="TH SarabunPSK" w:cs="TH SarabunPSK"/>
-                <w:cs/>
-              </w:rPr>
-              <w:t/>
+              <w:t xml:space="preserve">{{assessment_criteria}}</w:t>
+            </w:r>
+          </w:p>
+          <w:p>
+            <w:pPr>
+              <w:rPr>
+                <w:rFonts w:ascii="TH SarabunPSK" w:hAnsi="TH SarabunPSK" w:cs="TH SarabunPSK"/>
+              </w:rPr>
+            </w:pPr>
+            <w:r>
+              <w:rPr>
+                <w:rFonts w:ascii="TH SarabunPSK" w:hAnsi="TH SarabunPSK" w:cs="TH SarabunPSK"/>
+                <w:cs/>
+              </w:rPr>
+              <w:t xml:space="preserve"/>
             </w:r>
           </w:p>
           <w:p>
@@ -20197,7 +20195,7 @@
         <w:rPr>
           <w:rFonts w:ascii="TH SarabunPSK" w:hAnsi="TH SarabunPSK" w:cs="TH SarabunPSK"/>
         </w:rPr>
-        <w:t>{{teaching_conclusion}}</w:t>
+        <w:t xml:space="preserve">{{teaching_conclusion}}</w:t>
       </w:r>
     </w:p>
     <w:p>
@@ -20605,7 +20603,7 @@
               </w:rPr>
             </w:pPr>
             <w:r>
-              <w:t>{{e_comp}}</w:t>
+              <w:t xml:space="preserve">{{e_comp}}</w:t>
             </w:r>
           </w:p>
         </w:tc>
@@ -20622,7 +20620,7 @@
               </w:rPr>
             </w:pPr>
             <w:r>
-              <w:t>{{e_expect}}</w:t>
+              <w:t xml:space="preserve">{{e_expect}}</w:t>
             </w:r>
           </w:p>
         </w:tc>
@@ -20638,7 +20636,7 @@
               </w:rPr>
             </w:pPr>
             <w:r>
-              <w:t>{{e_l1}}</w:t>
+              <w:t xml:space="preserve">{{e_l1}}</w:t>
             </w:r>
           </w:p>
         </w:tc>
@@ -20654,7 +20652,7 @@
               </w:rPr>
             </w:pPr>
             <w:r>
-              <w:t>{{e_l2}}</w:t>
+              <w:t xml:space="preserve">{{e_l2}}</w:t>
             </w:r>
           </w:p>
         </w:tc>
@@ -20670,7 +20668,7 @@
               </w:rPr>
             </w:pPr>
             <w:r>
-              <w:t>{{e_l3}}</w:t>
+              <w:t xml:space="preserve">{{e_l3}}</w:t>
             </w:r>
           </w:p>
         </w:tc>
@@ -20686,7 +20684,7 @@
               </w:rPr>
             </w:pPr>
             <w:r>
-              <w:t>{{e_l4}}</w:t>
+              <w:t xml:space="preserve">{{e_l4}}</w:t>
             </w:r>
           </w:p>
         </w:tc>
@@ -20702,7 +20700,7 @@
               </w:rPr>
             </w:pPr>
             <w:r>
-              <w:t>{{e_l5}}</w:t>
+              <w:t xml:space="preserve">{{e_l5}}</w:t>
             </w:r>
           </w:p>
         </w:tc>
@@ -20717,7 +20715,7 @@
               </w:rPr>
             </w:pPr>
             <w:r>
-              <w:t>{{e_percent}}</w:t>
+              <w:t xml:space="preserve">{{e_percent}}</w:t>
             </w:r>
           </w:p>
         </w:tc>
@@ -21097,7 +21095,7 @@
         <w:rPr>
           <w:rFonts w:ascii="TH SarabunPSK" w:hAnsi="TH SarabunPSK" w:cs="TH SarabunPSK"/>
         </w:rPr>
-        <w:t>{{teaching_problems}}</w:t>
+        <w:t xml:space="preserve">{{teaching_problems}}</w:t>
       </w:r>
     </w:p>
     <w:p>
@@ -21176,7 +21174,7 @@
         <w:rPr>
           <w:rFonts w:ascii="TH SarabunPSK" w:hAnsi="TH SarabunPSK" w:cs="TH SarabunPSK"/>
         </w:rPr>
-        <w:t>{{improvement_guideline}}</w:t>
+        <w:t xml:space="preserve">{{improvement_guideline}}</w:t>
       </w:r>
     </w:p>
     <w:p>
@@ -21261,7 +21259,7 @@
           <w:szCs w:val="30"/>
           <w:cs/>
         </w:rPr>
-        <w:t xml:space="preserve">          </w:t>
+        <w:t xml:space="preserve">          ลงชื่อ (Signature) {{teacher_sign}}ผู้สอน (Instructor)</w:t>
       </w:r>
       <w:r>
         <w:rPr>
@@ -21270,7 +21268,7 @@
           <w:szCs w:val="30"/>
           <w:cs/>
         </w:rPr>
-        <w:t>ลงชื่อ (</w:t>
+        <w:t/>
       </w:r>
       <w:r>
         <w:rPr>
@@ -21278,7 +21276,7 @@
           <w:sz w:val="30"/>
           <w:szCs w:val="30"/>
         </w:rPr>
-        <w:t>Signature</w:t>
+        <w:t/>
       </w:r>
       <w:r>
         <w:rPr>
@@ -21286,7 +21284,7 @@
           <w:sz w:val="30"/>
           <w:szCs w:val="30"/>
         </w:rPr>
-        <w:t>)</w:t>
+        <w:t/>
       </w:r>
       <w:r>
         <w:rPr>
@@ -21295,7 +21293,7 @@
           <w:szCs w:val="30"/>
           <w:cs/>
         </w:rPr>
-        <w:t xml:space="preserve"> </w:t>
+        <w:t xml:space="preserve"/>
       </w:r>
       <w:r>
         <w:rPr>
@@ -21303,7 +21301,7 @@
           <w:sz w:val="30"/>
           <w:szCs w:val="30"/>
         </w:rPr>
-        <w:t>{{teacher_sign}}</w:t>
+        <w:t/>
       </w:r>
       <w:r>
         <w:rPr>
@@ -21312,7 +21310,7 @@
           <w:szCs w:val="30"/>
           <w:cs/>
         </w:rPr>
-        <w:t xml:space="preserve">ผู้สอน </w:t>
+        <w:t xml:space="preserve"/>
       </w:r>
       <w:r>
         <w:rPr>
@@ -21320,7 +21318,7 @@
           <w:sz w:val="30"/>
           <w:szCs w:val="30"/>
         </w:rPr>
-        <w:t>(</w:t>
+        <w:t/>
       </w:r>
       <w:r>
         <w:rPr>
@@ -21328,7 +21326,7 @@
           <w:sz w:val="30"/>
           <w:szCs w:val="30"/>
         </w:rPr>
-        <w:t>Instructor</w:t>
+        <w:t/>
       </w:r>
       <w:r>
         <w:rPr>
@@ -21336,7 +21334,7 @@
           <w:sz w:val="30"/>
           <w:szCs w:val="30"/>
         </w:rPr>
-        <w:t>)</w:t>
+        <w:t/>
       </w:r>
     </w:p>
     <w:p>
@@ -21394,7 +21392,7 @@
           <w:szCs w:val="30"/>
         </w:rPr>
         <w:tab/>
-        <w:t xml:space="preserve">   </w:t>
+        <w:t xml:space="preserve">     วันที่ (Date) {{teaching_record_date}}</w:t>
       </w:r>
       <w:r>
         <w:rPr>
@@ -21403,7 +21401,7 @@
           <w:szCs w:val="30"/>
           <w:cs/>
         </w:rPr>
-        <w:t xml:space="preserve">  </w:t>
+        <w:t xml:space="preserve"/>
       </w:r>
       <w:r>
         <w:rPr>
@@ -21412,7 +21410,7 @@
           <w:szCs w:val="30"/>
           <w:cs/>
         </w:rPr>
-        <w:t>วันที่ (</w:t>
+        <w:t/>
       </w:r>
       <w:r>
         <w:rPr>
@@ -21420,7 +21418,7 @@
           <w:sz w:val="30"/>
           <w:szCs w:val="30"/>
         </w:rPr>
-        <w:t>Date) {{teaching_record_date}}</w:t>
+        <w:t/>
       </w:r>
     </w:p>
     <w:p>
@@ -21547,14 +21545,14 @@
                 <w:szCs w:val="32"/>
                 <w:cs/>
               </w:rPr>
-              <w:t>ใบความรู้ ที่</w:t>
+              <w:t xml:space="preserve">ใบความรู้ ที่{{sheet_no}}</w:t>
             </w:r>
             <w:r>
               <w:rPr>
                 <w:rFonts w:ascii="TH SarabunPSK" w:hAnsi="TH SarabunPSK" w:cs="TH SarabunPSK"/>
                 <w:szCs w:val="32"/>
               </w:rPr>
-              <w:t>{{sheet_no}}</w:t>
+              <w:t/>
             </w:r>
           </w:p>
         </w:tc>
@@ -21583,7 +21581,7 @@
                 <w:szCs w:val="32"/>
                 <w:cs/>
               </w:rPr>
-              <w:t>หน่วยที่</w:t>
+              <w:t xml:space="preserve">หน่วยที่(No. of Unit) {{unit_no}}</w:t>
             </w:r>
             <w:r>
               <w:rPr>
@@ -21600,14 +21598,14 @@
                 <w:szCs w:val="32"/>
                 <w:cs/>
               </w:rPr>
-              <w:t>(</w:t>
+              <w:t/>
             </w:r>
             <w:r>
               <w:rPr>
                 <w:rFonts w:ascii="TH SarabunPSK" w:hAnsi="TH SarabunPSK" w:cs="TH SarabunPSK"/>
                 <w:szCs w:val="32"/>
               </w:rPr>
-              <w:t>No. of Unit)</w:t>
+              <w:t/>
             </w:r>
             <w:r>
               <w:rPr>
@@ -21615,14 +21613,14 @@
                 <w:szCs w:val="32"/>
                 <w:cs/>
               </w:rPr>
-              <w:t xml:space="preserve"> </w:t>
+              <w:t xml:space="preserve"/>
             </w:r>
             <w:r>
               <w:rPr>
                 <w:rFonts w:ascii="TH SarabunPSK" w:hAnsi="TH SarabunPSK" w:cs="TH SarabunPSK"/>
                 <w:szCs w:val="32"/>
               </w:rPr>
-              <w:t>{{unit_no}}</w:t>
+              <w:t/>
             </w:r>
           </w:p>
         </w:tc>
@@ -21657,7 +21655,7 @@
                 <w:szCs w:val="32"/>
                 <w:cs/>
               </w:rPr>
-              <w:t>รหัสวิชา</w:t>
+              <w:t xml:space="preserve">รหัสวิชา (Subject Code) {{course_code}}</w:t>
             </w:r>
             <w:r>
               <w:rPr>
@@ -21665,7 +21663,7 @@
                 <w:szCs w:val="32"/>
                 <w:cs/>
               </w:rPr>
-              <w:t xml:space="preserve"> </w:t>
+              <w:t xml:space="preserve"/>
             </w:r>
             <w:r>
               <w:rPr>
@@ -21675,7 +21673,7 @@
                 <w:szCs w:val="32"/>
                 <w:cs/>
               </w:rPr>
-              <w:t>(</w:t>
+              <w:t/>
             </w:r>
             <w:r>
               <w:rPr>
@@ -21684,7 +21682,7 @@
                 <w:bCs w:val="0"/>
                 <w:szCs w:val="32"/>
               </w:rPr>
-              <w:t>Subject Code</w:t>
+              <w:t/>
             </w:r>
             <w:r>
               <w:rPr>
@@ -21694,7 +21692,7 @@
                 <w:szCs w:val="32"/>
                 <w:cs/>
               </w:rPr>
-              <w:t>)</w:t>
+              <w:t/>
             </w:r>
             <w:r>
               <w:rPr>
@@ -21702,14 +21700,14 @@
                 <w:szCs w:val="32"/>
                 <w:cs/>
               </w:rPr>
-              <w:t xml:space="preserve"> </w:t>
+              <w:t xml:space="preserve"/>
             </w:r>
             <w:r>
               <w:rPr>
                 <w:rFonts w:ascii="TH SarabunPSK" w:hAnsi="TH SarabunPSK" w:cs="TH SarabunPSK"/>
                 <w:szCs w:val="32"/>
               </w:rPr>
-              <w:t>{{course_code}}</w:t>
+              <w:t/>
             </w:r>
             <w:r>
               <w:rPr>
@@ -21743,7 +21741,7 @@
                 <w:szCs w:val="32"/>
                 <w:cs/>
               </w:rPr>
-              <w:t>ชื่อวิชา</w:t>
+              <w:t xml:space="preserve">ชื่อวิชา (Subject Name) {{course}} </w:t>
             </w:r>
             <w:r>
               <w:rPr>
@@ -21751,7 +21749,7 @@
                 <w:szCs w:val="32"/>
                 <w:cs/>
               </w:rPr>
-              <w:t xml:space="preserve"> </w:t>
+              <w:t xml:space="preserve"/>
             </w:r>
             <w:r>
               <w:rPr>
@@ -21761,7 +21759,7 @@
                 <w:szCs w:val="32"/>
                 <w:cs/>
               </w:rPr>
-              <w:t>(</w:t>
+              <w:t/>
             </w:r>
             <w:r>
               <w:rPr>
@@ -21770,7 +21768,7 @@
                 <w:bCs w:val="0"/>
                 <w:szCs w:val="32"/>
               </w:rPr>
-              <w:t>Subject Name</w:t>
+              <w:t/>
             </w:r>
             <w:r>
               <w:rPr>
@@ -21780,14 +21778,14 @@
                 <w:szCs w:val="32"/>
                 <w:cs/>
               </w:rPr>
-              <w:t xml:space="preserve">) </w:t>
+              <w:t xml:space="preserve"/>
             </w:r>
             <w:r>
               <w:rPr>
                 <w:rFonts w:ascii="TH SarabunPSK" w:hAnsi="TH SarabunPSK" w:cs="TH SarabunPSK"/>
                 <w:szCs w:val="32"/>
               </w:rPr>
-              <w:t>{{course}}</w:t>
+              <w:t/>
             </w:r>
             <w:r>
               <w:rPr>
@@ -21795,7 +21793,7 @@
                 <w:szCs w:val="32"/>
                 <w:u w:val="dotted"/>
               </w:rPr>
-              <w:t xml:space="preserve"> </w:t>
+              <w:t xml:space="preserve"/>
             </w:r>
           </w:p>
         </w:tc>
@@ -21822,7 +21820,7 @@
                 <w:szCs w:val="32"/>
                 <w:cs/>
               </w:rPr>
-              <w:t>สอนครั้งที่</w:t>
+              <w:t xml:space="preserve">สอนครั้งที่{{session_no}}      </w:t>
             </w:r>
             <w:r>
               <w:rPr>
@@ -21830,14 +21828,14 @@
                 <w:szCs w:val="32"/>
                 <w:cs/>
               </w:rPr>
-              <w:t>{{session_no}}</w:t>
+              <w:t/>
             </w:r>
             <w:r>
               <w:rPr>
                 <w:rFonts w:ascii="TH SarabunPSK" w:hAnsi="TH SarabunPSK" w:cs="TH SarabunPSK"/>
                 <w:szCs w:val="32"/>
               </w:rPr>
-              <w:t xml:space="preserve">   </w:t>
+              <w:t xml:space="preserve"/>
             </w:r>
             <w:r>
               <w:rPr>
@@ -21845,7 +21843,7 @@
                 <w:szCs w:val="32"/>
                 <w:u w:val="dotted"/>
               </w:rPr>
-              <w:t xml:space="preserve">   </w:t>
+              <w:t xml:space="preserve"/>
             </w:r>
           </w:p>
         </w:tc>
@@ -21884,7 +21882,7 @@
                 <w:szCs w:val="32"/>
                 <w:cs/>
               </w:rPr>
-              <w:t>ชื่อหน่วยการเรียนรู้</w:t>
+              <w:t xml:space="preserve">ชื่อหน่วยการเรียนรู้ (Unit) {{unit_title}}</w:t>
             </w:r>
             <w:r>
               <w:rPr>
@@ -21892,7 +21890,7 @@
                 <w:szCs w:val="32"/>
                 <w:cs/>
               </w:rPr>
-              <w:t xml:space="preserve"> </w:t>
+              <w:t xml:space="preserve"/>
             </w:r>
             <w:r>
               <w:rPr>
@@ -21902,7 +21900,7 @@
                 <w:szCs w:val="32"/>
                 <w:cs/>
               </w:rPr>
-              <w:t>(</w:t>
+              <w:t/>
             </w:r>
             <w:r>
               <w:rPr>
@@ -21911,7 +21909,7 @@
                 <w:bCs w:val="0"/>
                 <w:szCs w:val="32"/>
               </w:rPr>
-              <w:t>Unit</w:t>
+              <w:t/>
             </w:r>
             <w:r>
               <w:rPr>
@@ -21921,7 +21919,7 @@
                 <w:szCs w:val="32"/>
                 <w:cs/>
               </w:rPr>
-              <w:t xml:space="preserve">) </w:t>
+              <w:t xml:space="preserve"/>
             </w:r>
             <w:r>
               <w:rPr>
@@ -21929,7 +21927,7 @@
                 <w:szCs w:val="32"/>
                 <w:cs/>
               </w:rPr>
-              <w:t>{{unit_title}}</w:t>
+              <w:t/>
             </w:r>
             <w:r>
               <w:rPr>
@@ -21974,14 +21972,14 @@
                 <w:szCs w:val="32"/>
                 <w:cs/>
               </w:rPr>
-              <w:t>ทฤษฎี</w:t>
+              <w:t xml:space="preserve">ทฤษฎี (Theory) {{theory_hours}}  ชม. (Hr.)</w:t>
             </w:r>
             <w:r>
               <w:rPr>
                 <w:rFonts w:ascii="TH SarabunPSK" w:hAnsi="TH SarabunPSK" w:cs="TH SarabunPSK"/>
                 <w:szCs w:val="32"/>
               </w:rPr>
-              <w:t xml:space="preserve"> </w:t>
+              <w:t xml:space="preserve"/>
             </w:r>
             <w:r>
               <w:rPr>
@@ -21991,7 +21989,7 @@
                 <w:szCs w:val="32"/>
                 <w:cs/>
               </w:rPr>
-              <w:t>(</w:t>
+              <w:t/>
             </w:r>
             <w:r>
               <w:rPr>
@@ -22000,7 +21998,7 @@
                 <w:bCs w:val="0"/>
                 <w:szCs w:val="32"/>
               </w:rPr>
-              <w:t>Theory</w:t>
+              <w:t/>
             </w:r>
             <w:r>
               <w:rPr>
@@ -22010,7 +22008,7 @@
                 <w:szCs w:val="32"/>
                 <w:cs/>
               </w:rPr>
-              <w:t xml:space="preserve">) </w:t>
+              <w:t xml:space="preserve"/>
             </w:r>
             <w:r>
               <w:rPr>
@@ -22018,7 +22016,7 @@
                 <w:szCs w:val="32"/>
                 <w:cs/>
               </w:rPr>
-              <w:t>{{theory_hours}}</w:t>
+              <w:t/>
             </w:r>
             <w:r>
               <w:rPr>
@@ -22033,7 +22031,7 @@
                 <w:rFonts w:ascii="TH SarabunPSK" w:hAnsi="TH SarabunPSK" w:cs="TH SarabunPSK"/>
                 <w:szCs w:val="32"/>
               </w:rPr>
-              <w:t xml:space="preserve">  </w:t>
+              <w:t xml:space="preserve"/>
             </w:r>
             <w:r>
               <w:rPr>
@@ -22041,14 +22039,14 @@
                 <w:szCs w:val="32"/>
                 <w:cs/>
               </w:rPr>
-              <w:t>ชม.</w:t>
+              <w:t/>
             </w:r>
             <w:r>
               <w:rPr>
                 <w:rFonts w:ascii="TH SarabunPSK" w:hAnsi="TH SarabunPSK" w:cs="TH SarabunPSK"/>
                 <w:szCs w:val="32"/>
               </w:rPr>
-              <w:t xml:space="preserve"> </w:t>
+              <w:t xml:space="preserve"/>
             </w:r>
             <w:r>
               <w:rPr>
@@ -22058,7 +22056,7 @@
                 <w:szCs w:val="32"/>
                 <w:cs/>
               </w:rPr>
-              <w:t>(</w:t>
+              <w:t/>
             </w:r>
             <w:r>
               <w:rPr>
@@ -22067,7 +22065,7 @@
                 <w:bCs w:val="0"/>
                 <w:szCs w:val="32"/>
               </w:rPr>
-              <w:t>Hr.</w:t>
+              <w:t/>
             </w:r>
             <w:r>
               <w:rPr>
@@ -22077,7 +22075,7 @@
                 <w:szCs w:val="32"/>
                 <w:cs/>
               </w:rPr>
-              <w:t>)</w:t>
+              <w:t/>
             </w:r>
           </w:p>
           <w:p>
@@ -22097,14 +22095,14 @@
                 <w:szCs w:val="32"/>
                 <w:cs/>
               </w:rPr>
-              <w:t>ปฏิบัติ</w:t>
+              <w:t xml:space="preserve">ปฏิบัติ (Practical) {{practical_hours}} ชม. (Hr.)</w:t>
             </w:r>
             <w:r>
               <w:rPr>
                 <w:rFonts w:ascii="TH SarabunPSK" w:hAnsi="TH SarabunPSK" w:cs="TH SarabunPSK"/>
                 <w:szCs w:val="32"/>
               </w:rPr>
-              <w:t xml:space="preserve"> </w:t>
+              <w:t xml:space="preserve"/>
             </w:r>
             <w:r>
               <w:rPr>
@@ -22114,7 +22112,7 @@
                 <w:szCs w:val="32"/>
                 <w:cs/>
               </w:rPr>
-              <w:t>(</w:t>
+              <w:t/>
             </w:r>
             <w:r>
               <w:rPr>
@@ -22123,7 +22121,7 @@
                 <w:bCs w:val="0"/>
                 <w:szCs w:val="32"/>
               </w:rPr>
-              <w:t>Practical</w:t>
+              <w:t/>
             </w:r>
             <w:r>
               <w:rPr>
@@ -22133,7 +22131,7 @@
                 <w:szCs w:val="32"/>
                 <w:cs/>
               </w:rPr>
-              <w:t xml:space="preserve">) </w:t>
+              <w:t xml:space="preserve"/>
             </w:r>
             <w:r>
               <w:rPr>
@@ -22141,7 +22139,7 @@
                 <w:szCs w:val="32"/>
                 <w:cs/>
               </w:rPr>
-              <w:t xml:space="preserve">{{practical_hours}} </w:t>
+              <w:t xml:space="preserve"/>
             </w:r>
             <w:r>
               <w:rPr>
@@ -22149,7 +22147,7 @@
                 <w:szCs w:val="32"/>
                 <w:cs/>
               </w:rPr>
-              <w:t>ชม.</w:t>
+              <w:t/>
             </w:r>
             <w:r>
               <w:rPr>
@@ -22157,7 +22155,7 @@
                 <w:szCs w:val="32"/>
                 <w:cs/>
               </w:rPr>
-              <w:t xml:space="preserve"> </w:t>
+              <w:t xml:space="preserve"/>
             </w:r>
             <w:r>
               <w:rPr>
@@ -22167,7 +22165,7 @@
                 <w:szCs w:val="32"/>
                 <w:cs/>
               </w:rPr>
-              <w:t>(</w:t>
+              <w:t/>
             </w:r>
             <w:r>
               <w:rPr>
@@ -22176,7 +22174,7 @@
                 <w:bCs w:val="0"/>
                 <w:szCs w:val="32"/>
               </w:rPr>
-              <w:t>Hr.)</w:t>
+              <w:t/>
             </w:r>
           </w:p>
         </w:tc>
@@ -22204,7 +22202,7 @@
                 <w:szCs w:val="32"/>
                 <w:cs/>
               </w:rPr>
-              <w:t>ชื่อเรื่อง</w:t>
+              <w:t xml:space="preserve">ชื่อเรื่อง (Unit Title) {{assignment_title}}  </w:t>
             </w:r>
             <w:r>
               <w:rPr>
@@ -22212,7 +22210,7 @@
                 <w:szCs w:val="32"/>
                 <w:cs/>
               </w:rPr>
-              <w:t xml:space="preserve"> </w:t>
+              <w:t xml:space="preserve"/>
             </w:r>
             <w:r>
               <w:rPr>
@@ -22222,7 +22220,7 @@
                 <w:szCs w:val="32"/>
                 <w:cs/>
               </w:rPr>
-              <w:t>(</w:t>
+              <w:t/>
             </w:r>
             <w:r>
               <w:rPr>
@@ -22231,7 +22229,7 @@
                 <w:bCs w:val="0"/>
                 <w:szCs w:val="32"/>
               </w:rPr>
-              <w:t>Unit Title</w:t>
+              <w:t/>
             </w:r>
             <w:r>
               <w:rPr>
@@ -22241,7 +22239,7 @@
                 <w:szCs w:val="32"/>
                 <w:cs/>
               </w:rPr>
-              <w:t xml:space="preserve">) </w:t>
+              <w:t xml:space="preserve"/>
             </w:r>
             <w:r>
               <w:rPr>
@@ -22249,7 +22247,7 @@
                 <w:szCs w:val="32"/>
                 <w:cs/>
               </w:rPr>
-              <w:t>{{assignment_title}}</w:t>
+              <w:t/>
             </w:r>
             <w:r>
               <w:rPr>
@@ -22265,7 +22263,7 @@
                 <w:szCs w:val="32"/>
                 <w:cs/>
               </w:rPr>
-              <w:t xml:space="preserve">  </w:t>
+              <w:t xml:space="preserve"/>
             </w:r>
           </w:p>
         </w:tc>
@@ -22386,166 +22384,166 @@
                 <w:rFonts w:ascii="TH SarabunPSK" w:hAnsi="TH SarabunPSK" w:cs="TH SarabunPSK"/>
                 <w:cs/>
               </w:rPr>
-              <w:t>{{assignment_content}}</w:t>
-            </w:r>
-          </w:p>
-          <w:p>
-            <w:pPr>
-              <w:rPr>
-                <w:rFonts w:ascii="TH SarabunPSK" w:hAnsi="TH SarabunPSK" w:cs="TH SarabunPSK"/>
-                <w:cs/>
-              </w:rPr>
-            </w:pPr>
-            <w:r>
-              <w:rPr>
-                <w:rFonts w:ascii="TH SarabunPSK" w:hAnsi="TH SarabunPSK" w:cs="TH SarabunPSK"/>
-                <w:cs/>
-              </w:rPr>
-              <w:t/>
-            </w:r>
-          </w:p>
-          <w:p>
-            <w:pPr>
-              <w:rPr>
-                <w:rFonts w:ascii="TH SarabunPSK" w:hAnsi="TH SarabunPSK" w:cs="TH SarabunPSK"/>
-                <w:cs/>
-              </w:rPr>
-            </w:pPr>
-            <w:r>
-              <w:rPr>
-                <w:rFonts w:ascii="TH SarabunPSK" w:hAnsi="TH SarabunPSK" w:cs="TH SarabunPSK"/>
-                <w:cs/>
-              </w:rPr>
-              <w:t/>
-            </w:r>
-          </w:p>
-          <w:p>
-            <w:pPr>
-              <w:rPr>
-                <w:rFonts w:ascii="TH SarabunPSK" w:hAnsi="TH SarabunPSK" w:cs="TH SarabunPSK"/>
-              </w:rPr>
-            </w:pPr>
-            <w:r>
-              <w:rPr>
-                <w:rFonts w:ascii="TH SarabunPSK" w:hAnsi="TH SarabunPSK" w:cs="TH SarabunPSK"/>
-                <w:cs/>
-              </w:rPr>
-              <w:t/>
-            </w:r>
-          </w:p>
-          <w:p>
-            <w:pPr>
-              <w:rPr>
-                <w:rFonts w:ascii="TH SarabunPSK" w:hAnsi="TH SarabunPSK" w:cs="TH SarabunPSK"/>
-                <w:cs/>
-              </w:rPr>
-            </w:pPr>
-            <w:r>
-              <w:rPr>
-                <w:rFonts w:ascii="TH SarabunPSK" w:hAnsi="TH SarabunPSK" w:cs="TH SarabunPSK"/>
-                <w:cs/>
-              </w:rPr>
-              <w:t/>
-            </w:r>
-          </w:p>
-          <w:p>
-            <w:pPr>
-              <w:rPr>
-                <w:rFonts w:ascii="TH SarabunPSK" w:hAnsi="TH SarabunPSK" w:cs="TH SarabunPSK"/>
-              </w:rPr>
-            </w:pPr>
-            <w:r>
-              <w:rPr>
-                <w:rFonts w:ascii="TH SarabunPSK" w:hAnsi="TH SarabunPSK" w:cs="TH SarabunPSK"/>
-                <w:cs/>
-              </w:rPr>
-              <w:t/>
-            </w:r>
-          </w:p>
-          <w:p>
-            <w:pPr>
-              <w:rPr>
-                <w:rFonts w:ascii="TH SarabunPSK" w:hAnsi="TH SarabunPSK" w:cs="TH SarabunPSK"/>
-                <w:cs/>
-              </w:rPr>
-            </w:pPr>
-            <w:r>
-              <w:rPr>
-                <w:rFonts w:ascii="TH SarabunPSK" w:hAnsi="TH SarabunPSK" w:cs="TH SarabunPSK"/>
-                <w:cs/>
-              </w:rPr>
-              <w:t/>
-            </w:r>
-          </w:p>
-          <w:p>
-            <w:pPr>
-              <w:rPr>
-                <w:rFonts w:ascii="TH SarabunPSK" w:hAnsi="TH SarabunPSK" w:cs="TH SarabunPSK"/>
-              </w:rPr>
-            </w:pPr>
-            <w:r>
-              <w:rPr>
-                <w:rFonts w:ascii="TH SarabunPSK" w:hAnsi="TH SarabunPSK" w:cs="TH SarabunPSK"/>
-                <w:cs/>
-              </w:rPr>
-              <w:t/>
-            </w:r>
-          </w:p>
-          <w:p>
-            <w:pPr>
-              <w:rPr>
-                <w:rFonts w:ascii="TH SarabunPSK" w:hAnsi="TH SarabunPSK" w:cs="TH SarabunPSK"/>
-              </w:rPr>
-            </w:pPr>
-            <w:r>
-              <w:rPr>
-                <w:rFonts w:ascii="TH SarabunPSK" w:hAnsi="TH SarabunPSK" w:cs="TH SarabunPSK"/>
-                <w:cs/>
-              </w:rPr>
-              <w:t/>
-            </w:r>
-          </w:p>
-          <w:p>
-            <w:pPr>
-              <w:rPr>
-                <w:rFonts w:ascii="TH SarabunPSK" w:hAnsi="TH SarabunPSK" w:cs="TH SarabunPSK"/>
-                <w:cs/>
-              </w:rPr>
-            </w:pPr>
-            <w:r>
-              <w:rPr>
-                <w:rFonts w:ascii="TH SarabunPSK" w:hAnsi="TH SarabunPSK" w:cs="TH SarabunPSK"/>
-                <w:cs/>
-              </w:rPr>
-              <w:t/>
-            </w:r>
-          </w:p>
-          <w:p>
-            <w:pPr>
-              <w:rPr>
-                <w:rFonts w:ascii="TH SarabunPSK" w:hAnsi="TH SarabunPSK" w:cs="TH SarabunPSK"/>
-              </w:rPr>
-            </w:pPr>
-            <w:r>
-              <w:rPr>
-                <w:rFonts w:ascii="TH SarabunPSK" w:hAnsi="TH SarabunPSK" w:cs="TH SarabunPSK"/>
-                <w:cs/>
-              </w:rPr>
-              <w:t/>
-            </w:r>
-          </w:p>
-          <w:p>
-            <w:pPr>
-              <w:rPr>
-                <w:rFonts w:ascii="TH SarabunPSK" w:hAnsi="TH SarabunPSK" w:cs="TH SarabunPSK"/>
-              </w:rPr>
-            </w:pPr>
-            <w:r>
-              <w:rPr>
-                <w:rFonts w:ascii="TH SarabunPSK" w:hAnsi="TH SarabunPSK" w:cs="TH SarabunPSK"/>
-                <w:cs/>
-              </w:rPr>
-              <w:t/>
+              <w:t xml:space="preserve">{{assignment_content}}</w:t>
+            </w:r>
+          </w:p>
+          <w:p>
+            <w:pPr>
+              <w:rPr>
+                <w:rFonts w:ascii="TH SarabunPSK" w:hAnsi="TH SarabunPSK" w:cs="TH SarabunPSK"/>
+                <w:cs/>
+              </w:rPr>
+            </w:pPr>
+            <w:r>
+              <w:rPr>
+                <w:rFonts w:ascii="TH SarabunPSK" w:hAnsi="TH SarabunPSK" w:cs="TH SarabunPSK"/>
+                <w:cs/>
+              </w:rPr>
+              <w:t xml:space="preserve"/>
+            </w:r>
+          </w:p>
+          <w:p>
+            <w:pPr>
+              <w:rPr>
+                <w:rFonts w:ascii="TH SarabunPSK" w:hAnsi="TH SarabunPSK" w:cs="TH SarabunPSK"/>
+                <w:cs/>
+              </w:rPr>
+            </w:pPr>
+            <w:r>
+              <w:rPr>
+                <w:rFonts w:ascii="TH SarabunPSK" w:hAnsi="TH SarabunPSK" w:cs="TH SarabunPSK"/>
+                <w:cs/>
+              </w:rPr>
+              <w:t xml:space="preserve"/>
+            </w:r>
+          </w:p>
+          <w:p>
+            <w:pPr>
+              <w:rPr>
+                <w:rFonts w:ascii="TH SarabunPSK" w:hAnsi="TH SarabunPSK" w:cs="TH SarabunPSK"/>
+              </w:rPr>
+            </w:pPr>
+            <w:r>
+              <w:rPr>
+                <w:rFonts w:ascii="TH SarabunPSK" w:hAnsi="TH SarabunPSK" w:cs="TH SarabunPSK"/>
+                <w:cs/>
+              </w:rPr>
+              <w:t xml:space="preserve"/>
+            </w:r>
+          </w:p>
+          <w:p>
+            <w:pPr>
+              <w:rPr>
+                <w:rFonts w:ascii="TH SarabunPSK" w:hAnsi="TH SarabunPSK" w:cs="TH SarabunPSK"/>
+                <w:cs/>
+              </w:rPr>
+            </w:pPr>
+            <w:r>
+              <w:rPr>
+                <w:rFonts w:ascii="TH SarabunPSK" w:hAnsi="TH SarabunPSK" w:cs="TH SarabunPSK"/>
+                <w:cs/>
+              </w:rPr>
+              <w:t xml:space="preserve"/>
+            </w:r>
+          </w:p>
+          <w:p>
+            <w:pPr>
+              <w:rPr>
+                <w:rFonts w:ascii="TH SarabunPSK" w:hAnsi="TH SarabunPSK" w:cs="TH SarabunPSK"/>
+              </w:rPr>
+            </w:pPr>
+            <w:r>
+              <w:rPr>
+                <w:rFonts w:ascii="TH SarabunPSK" w:hAnsi="TH SarabunPSK" w:cs="TH SarabunPSK"/>
+                <w:cs/>
+              </w:rPr>
+              <w:t xml:space="preserve"/>
+            </w:r>
+          </w:p>
+          <w:p>
+            <w:pPr>
+              <w:rPr>
+                <w:rFonts w:ascii="TH SarabunPSK" w:hAnsi="TH SarabunPSK" w:cs="TH SarabunPSK"/>
+                <w:cs/>
+              </w:rPr>
+            </w:pPr>
+            <w:r>
+              <w:rPr>
+                <w:rFonts w:ascii="TH SarabunPSK" w:hAnsi="TH SarabunPSK" w:cs="TH SarabunPSK"/>
+                <w:cs/>
+              </w:rPr>
+              <w:t xml:space="preserve"/>
+            </w:r>
+          </w:p>
+          <w:p>
+            <w:pPr>
+              <w:rPr>
+                <w:rFonts w:ascii="TH SarabunPSK" w:hAnsi="TH SarabunPSK" w:cs="TH SarabunPSK"/>
+              </w:rPr>
+            </w:pPr>
+            <w:r>
+              <w:rPr>
+                <w:rFonts w:ascii="TH SarabunPSK" w:hAnsi="TH SarabunPSK" w:cs="TH SarabunPSK"/>
+                <w:cs/>
+              </w:rPr>
+              <w:t xml:space="preserve"/>
+            </w:r>
+          </w:p>
+          <w:p>
+            <w:pPr>
+              <w:rPr>
+                <w:rFonts w:ascii="TH SarabunPSK" w:hAnsi="TH SarabunPSK" w:cs="TH SarabunPSK"/>
+              </w:rPr>
+            </w:pPr>
+            <w:r>
+              <w:rPr>
+                <w:rFonts w:ascii="TH SarabunPSK" w:hAnsi="TH SarabunPSK" w:cs="TH SarabunPSK"/>
+                <w:cs/>
+              </w:rPr>
+              <w:t xml:space="preserve"/>
+            </w:r>
+          </w:p>
+          <w:p>
+            <w:pPr>
+              <w:rPr>
+                <w:rFonts w:ascii="TH SarabunPSK" w:hAnsi="TH SarabunPSK" w:cs="TH SarabunPSK"/>
+                <w:cs/>
+              </w:rPr>
+            </w:pPr>
+            <w:r>
+              <w:rPr>
+                <w:rFonts w:ascii="TH SarabunPSK" w:hAnsi="TH SarabunPSK" w:cs="TH SarabunPSK"/>
+                <w:cs/>
+              </w:rPr>
+              <w:t xml:space="preserve"/>
+            </w:r>
+          </w:p>
+          <w:p>
+            <w:pPr>
+              <w:rPr>
+                <w:rFonts w:ascii="TH SarabunPSK" w:hAnsi="TH SarabunPSK" w:cs="TH SarabunPSK"/>
+              </w:rPr>
+            </w:pPr>
+            <w:r>
+              <w:rPr>
+                <w:rFonts w:ascii="TH SarabunPSK" w:hAnsi="TH SarabunPSK" w:cs="TH SarabunPSK"/>
+                <w:cs/>
+              </w:rPr>
+              <w:t xml:space="preserve"/>
+            </w:r>
+          </w:p>
+          <w:p>
+            <w:pPr>
+              <w:rPr>
+                <w:rFonts w:ascii="TH SarabunPSK" w:hAnsi="TH SarabunPSK" w:cs="TH SarabunPSK"/>
+              </w:rPr>
+            </w:pPr>
+            <w:r>
+              <w:rPr>
+                <w:rFonts w:ascii="TH SarabunPSK" w:hAnsi="TH SarabunPSK" w:cs="TH SarabunPSK"/>
+                <w:cs/>
+              </w:rPr>
+              <w:t xml:space="preserve"/>
             </w:r>
           </w:p>
           <w:p>
@@ -22787,7 +22785,7 @@
           <w:szCs w:val="32"/>
           <w:cs/>
         </w:rPr>
-        <w:t xml:space="preserve"> ควรปรับปรุงเกี่ยวกับ</w:t>
+        <w:t xml:space="preserve"> ควรปรับปรุงเกี่ยวกับ (Needs revision regarding) {{department_head_revision_topic}}</w:t>
       </w:r>
       <w:r>
         <w:rPr>
@@ -22796,7 +22794,7 @@
           <w:szCs w:val="32"/>
           <w:cs/>
         </w:rPr>
-        <w:t xml:space="preserve"> (</w:t>
+        <w:t xml:space="preserve"/>
       </w:r>
       <w:r>
         <w:rPr>
@@ -22804,7 +22802,7 @@
           <w:sz w:val="32"/>
           <w:szCs w:val="32"/>
         </w:rPr>
-        <w:t>Needs revision regarding</w:t>
+        <w:t/>
       </w:r>
       <w:r>
         <w:rPr>
@@ -22813,7 +22811,7 @@
           <w:szCs w:val="32"/>
           <w:cs/>
         </w:rPr>
-        <w:t>) {{department_head_revision_topic}}</w:t>
+        <w:t/>
       </w:r>
       <w:r>
         <w:rPr>
@@ -22835,7 +22833,7 @@
         <w:rPr>
           <w:rFonts w:ascii="TH SarabunPSK" w:hAnsi="TH SarabunPSK" w:cs="TH SarabunPSK"/>
         </w:rPr>
-        <w:t>{{department_head_revision_detail}}</w:t>
+        <w:t xml:space="preserve">{{department_head_revision_detail}}</w:t>
       </w:r>
     </w:p>
     <w:p>
@@ -22932,7 +22930,7 @@
           <w:cs/>
         </w:rPr>
         <w:tab/>
-        <w:t xml:space="preserve">ลงชื่อ </w:t>
+        <w:t xml:space="preserve">ลงชื่อ (Signature) {{dept_sign}} </w:t>
       </w:r>
       <w:r>
         <w:rPr>
@@ -22941,7 +22939,7 @@
           <w:szCs w:val="32"/>
           <w:cs/>
         </w:rPr>
-        <w:t>(</w:t>
+        <w:t/>
       </w:r>
       <w:r>
         <w:rPr>
@@ -22949,7 +22947,7 @@
           <w:sz w:val="32"/>
           <w:szCs w:val="32"/>
         </w:rPr>
-        <w:t>Signature)</w:t>
+        <w:t/>
       </w:r>
       <w:r>
         <w:rPr>
@@ -22958,7 +22956,7 @@
           <w:szCs w:val="32"/>
           <w:cs/>
         </w:rPr>
-        <w:t xml:space="preserve"> {{dept_sign}}</w:t>
+        <w:t xml:space="preserve"/>
       </w:r>
       <w:r>
         <w:rPr>
@@ -22967,7 +22965,7 @@
           <w:szCs w:val="32"/>
           <w:cs/>
         </w:rPr>
-        <w:t xml:space="preserve"> </w:t>
+        <w:t xml:space="preserve"/>
       </w:r>
     </w:p>
     <w:p>
@@ -22986,7 +22984,7 @@
           <w:szCs w:val="32"/>
           <w:cs/>
         </w:rPr>
-        <w:t>({{dept_head}})</w:t>
+        <w:t xml:space="preserve">({{dept_head}})  </w:t>
       </w:r>
       <w:r>
         <w:rPr>
@@ -22994,7 +22992,7 @@
           <w:sz w:val="32"/>
           <w:szCs w:val="32"/>
         </w:rPr>
-        <w:t xml:space="preserve">  </w:t>
+        <w:t xml:space="preserve"/>
       </w:r>
     </w:p>
     <w:p>
@@ -23135,7 +23133,7 @@
           <w:szCs w:val="32"/>
           <w:cs/>
         </w:rPr>
-        <w:t>{{dept_decision_date}}</w:t>
+        <w:t xml:space="preserve">{{dept_decision_date}}</w:t>
       </w:r>
     </w:p>
     <w:p>
@@ -23246,7 +23244,7 @@
         <w:rPr>
           <w:rFonts w:ascii="TH SarabunPSK" w:hAnsi="TH SarabunPSK" w:cs="TH SarabunPSK"/>
         </w:rPr>
-        <w:t>{{academic_director_comment}}</w:t>
+        <w:t xml:space="preserve">{{academic_director_comment}}</w:t>
       </w:r>
     </w:p>
     <w:p>
@@ -23308,7 +23306,7 @@
           <w:szCs w:val="32"/>
           <w:cs/>
         </w:rPr>
-        <w:t xml:space="preserve">        </w:t>
+        <w:t xml:space="preserve">        ({{director}})</w:t>
       </w:r>
       <w:r>
         <w:rPr>
@@ -23317,7 +23315,7 @@
           <w:szCs w:val="32"/>
           <w:cs/>
         </w:rPr>
-        <w:t>({{director}})</w:t>
+        <w:t/>
       </w:r>
     </w:p>
     <w:p>
@@ -23459,7 +23457,7 @@
           <w:szCs w:val="32"/>
           <w:cs/>
         </w:rPr>
-        <w:t>{{director_decision_date}}</w:t>
+        <w:t xml:space="preserve">{{director_decision_date}}</w:t>
       </w:r>
     </w:p>
     <w:p>

</xml_diff>